<commit_message>
Additions to use cases, assumptions, and requirements
</commit_message>
<xml_diff>
--- a/docs/SRS_Group5_BankApp.docx
+++ b/docs/SRS_Group5_BankApp.docx
@@ -1716,6 +1716,165 @@
                 <w:u w:val="single"/>
               </w:rPr>
             </w:pPr>
+            <w:r>
+              <w:rPr>
+                <w:color w:val="000000"/>
+                <w:u w:val="single"/>
+              </w:rPr>
+              <w:t>03/05/2026</w:t>
+            </w:r>
+          </w:p>
+        </w:tc>
+        <w:tc>
+          <w:tcPr>
+            <w:tcW w:w="1083" w:type="dxa"/>
+            <w:tcBorders>
+              <w:top w:val="single" w:sz="6" w:space="0" w:color="000000"/>
+              <w:left w:val="single" w:sz="6" w:space="0" w:color="000000"/>
+              <w:bottom w:val="single" w:sz="6" w:space="0" w:color="000000"/>
+            </w:tcBorders>
+            <w:shd w:val="clear" w:color="auto" w:fill="E5E5E5"/>
+          </w:tcPr>
+          <w:p>
+            <w:pPr>
+              <w:widowControl w:val="0"/>
+              <w:pBdr>
+                <w:top w:val="nil"/>
+                <w:left w:val="nil"/>
+                <w:bottom w:val="nil"/>
+                <w:right w:val="nil"/>
+                <w:between w:val="nil"/>
+              </w:pBdr>
+              <w:spacing w:before="40" w:after="40"/>
+              <w:rPr>
+                <w:color w:val="000000"/>
+              </w:rPr>
+            </w:pPr>
+            <w:r>
+              <w:rPr>
+                <w:color w:val="000000"/>
+              </w:rPr>
+              <w:t>0.10</w:t>
+            </w:r>
+          </w:p>
+        </w:tc>
+        <w:tc>
+          <w:tcPr>
+            <w:tcW w:w="3813" w:type="dxa"/>
+            <w:tcBorders>
+              <w:top w:val="single" w:sz="6" w:space="0" w:color="000000"/>
+              <w:left w:val="single" w:sz="6" w:space="0" w:color="000000"/>
+              <w:bottom w:val="single" w:sz="6" w:space="0" w:color="000000"/>
+            </w:tcBorders>
+            <w:shd w:val="clear" w:color="auto" w:fill="E5E5E5"/>
+          </w:tcPr>
+          <w:p>
+            <w:pPr>
+              <w:widowControl w:val="0"/>
+              <w:pBdr>
+                <w:top w:val="nil"/>
+                <w:left w:val="nil"/>
+                <w:bottom w:val="nil"/>
+                <w:right w:val="nil"/>
+                <w:between w:val="nil"/>
+              </w:pBdr>
+              <w:spacing w:before="40" w:after="40"/>
+              <w:rPr>
+                <w:color w:val="000000"/>
+              </w:rPr>
+            </w:pPr>
+            <w:r>
+              <w:rPr>
+                <w:color w:val="000000"/>
+              </w:rPr>
+              <w:t xml:space="preserve">Additions and updates use cases </w:t>
+            </w:r>
+          </w:p>
+          <w:p>
+            <w:pPr>
+              <w:widowControl w:val="0"/>
+              <w:pBdr>
+                <w:top w:val="nil"/>
+                <w:left w:val="nil"/>
+                <w:bottom w:val="nil"/>
+                <w:right w:val="nil"/>
+                <w:between w:val="nil"/>
+              </w:pBdr>
+              <w:spacing w:before="40" w:after="40"/>
+              <w:rPr>
+                <w:color w:val="000000"/>
+              </w:rPr>
+            </w:pPr>
+            <w:r>
+              <w:rPr>
+                <w:color w:val="000000"/>
+              </w:rPr>
+              <w:t>Additions to assumptions and requirements (2.5, 3.1.1, 4.1)</w:t>
+            </w:r>
+          </w:p>
+        </w:tc>
+        <w:tc>
+          <w:tcPr>
+            <w:tcW w:w="2591" w:type="dxa"/>
+            <w:tcBorders>
+              <w:top w:val="single" w:sz="6" w:space="0" w:color="000000"/>
+              <w:left w:val="single" w:sz="6" w:space="0" w:color="000000"/>
+              <w:bottom w:val="single" w:sz="6" w:space="0" w:color="000000"/>
+              <w:right w:val="single" w:sz="6" w:space="0" w:color="000000"/>
+            </w:tcBorders>
+            <w:shd w:val="clear" w:color="auto" w:fill="E5E5E5"/>
+          </w:tcPr>
+          <w:p>
+            <w:pPr>
+              <w:widowControl w:val="0"/>
+              <w:pBdr>
+                <w:top w:val="nil"/>
+                <w:left w:val="nil"/>
+                <w:bottom w:val="nil"/>
+                <w:right w:val="nil"/>
+                <w:between w:val="nil"/>
+              </w:pBdr>
+              <w:spacing w:before="40" w:after="40"/>
+              <w:rPr>
+                <w:color w:val="000000"/>
+              </w:rPr>
+            </w:pPr>
+            <w:r>
+              <w:rPr>
+                <w:color w:val="000000"/>
+              </w:rPr>
+              <w:t>Kayla Imus</w:t>
+            </w:r>
+          </w:p>
+        </w:tc>
+      </w:tr>
+      <w:tr>
+        <w:tc>
+          <w:tcPr>
+            <w:tcW w:w="1276" w:type="dxa"/>
+            <w:tcBorders>
+              <w:top w:val="single" w:sz="6" w:space="0" w:color="000000"/>
+              <w:left w:val="single" w:sz="6" w:space="0" w:color="000000"/>
+              <w:bottom w:val="single" w:sz="6" w:space="0" w:color="000000"/>
+            </w:tcBorders>
+            <w:shd w:val="clear" w:color="auto" w:fill="E5E5E5"/>
+          </w:tcPr>
+          <w:p>
+            <w:pPr>
+              <w:widowControl w:val="0"/>
+              <w:pBdr>
+                <w:top w:val="nil"/>
+                <w:left w:val="nil"/>
+                <w:bottom w:val="nil"/>
+                <w:right w:val="nil"/>
+                <w:between w:val="nil"/>
+              </w:pBdr>
+              <w:spacing w:before="40" w:after="40"/>
+              <w:rPr>
+                <w:color w:val="000000"/>
+                <w:u w:val="single"/>
+              </w:rPr>
+            </w:pPr>
           </w:p>
         </w:tc>
         <w:tc>
@@ -2473,118 +2632,6 @@
           </w:p>
         </w:tc>
       </w:tr>
-      <w:tr>
-        <w:tc>
-          <w:tcPr>
-            <w:tcW w:w="1276" w:type="dxa"/>
-            <w:tcBorders>
-              <w:top w:val="single" w:sz="6" w:space="0" w:color="000000"/>
-              <w:left w:val="single" w:sz="6" w:space="0" w:color="000000"/>
-              <w:bottom w:val="single" w:sz="6" w:space="0" w:color="000000"/>
-            </w:tcBorders>
-            <w:shd w:val="clear" w:color="auto" w:fill="E5E5E5"/>
-          </w:tcPr>
-          <w:p>
-            <w:pPr>
-              <w:widowControl w:val="0"/>
-              <w:pBdr>
-                <w:top w:val="nil"/>
-                <w:left w:val="nil"/>
-                <w:bottom w:val="nil"/>
-                <w:right w:val="nil"/>
-                <w:between w:val="nil"/>
-              </w:pBdr>
-              <w:spacing w:before="40" w:after="40"/>
-              <w:rPr>
-                <w:color w:val="000000"/>
-                <w:u w:val="single"/>
-              </w:rPr>
-            </w:pPr>
-          </w:p>
-        </w:tc>
-        <w:tc>
-          <w:tcPr>
-            <w:tcW w:w="1083" w:type="dxa"/>
-            <w:tcBorders>
-              <w:top w:val="single" w:sz="6" w:space="0" w:color="000000"/>
-              <w:left w:val="single" w:sz="6" w:space="0" w:color="000000"/>
-              <w:bottom w:val="single" w:sz="6" w:space="0" w:color="000000"/>
-            </w:tcBorders>
-            <w:shd w:val="clear" w:color="auto" w:fill="E5E5E5"/>
-          </w:tcPr>
-          <w:p>
-            <w:pPr>
-              <w:widowControl w:val="0"/>
-              <w:pBdr>
-                <w:top w:val="nil"/>
-                <w:left w:val="nil"/>
-                <w:bottom w:val="nil"/>
-                <w:right w:val="nil"/>
-                <w:between w:val="nil"/>
-              </w:pBdr>
-              <w:spacing w:before="40" w:after="40"/>
-              <w:rPr>
-                <w:color w:val="000000"/>
-              </w:rPr>
-            </w:pPr>
-          </w:p>
-        </w:tc>
-        <w:tc>
-          <w:tcPr>
-            <w:tcW w:w="3813" w:type="dxa"/>
-            <w:tcBorders>
-              <w:top w:val="single" w:sz="6" w:space="0" w:color="000000"/>
-              <w:left w:val="single" w:sz="6" w:space="0" w:color="000000"/>
-              <w:bottom w:val="single" w:sz="6" w:space="0" w:color="000000"/>
-            </w:tcBorders>
-            <w:shd w:val="clear" w:color="auto" w:fill="E5E5E5"/>
-          </w:tcPr>
-          <w:p>
-            <w:pPr>
-              <w:widowControl w:val="0"/>
-              <w:pBdr>
-                <w:top w:val="nil"/>
-                <w:left w:val="nil"/>
-                <w:bottom w:val="nil"/>
-                <w:right w:val="nil"/>
-                <w:between w:val="nil"/>
-              </w:pBdr>
-              <w:spacing w:before="40" w:after="40"/>
-              <w:rPr>
-                <w:color w:val="000000"/>
-              </w:rPr>
-            </w:pPr>
-          </w:p>
-        </w:tc>
-        <w:tc>
-          <w:tcPr>
-            <w:tcW w:w="2591" w:type="dxa"/>
-            <w:tcBorders>
-              <w:top w:val="single" w:sz="6" w:space="0" w:color="000000"/>
-              <w:left w:val="single" w:sz="6" w:space="0" w:color="000000"/>
-              <w:bottom w:val="single" w:sz="6" w:space="0" w:color="000000"/>
-              <w:right w:val="single" w:sz="6" w:space="0" w:color="000000"/>
-            </w:tcBorders>
-            <w:shd w:val="clear" w:color="auto" w:fill="E5E5E5"/>
-          </w:tcPr>
-          <w:p>
-            <w:pPr>
-              <w:widowControl w:val="0"/>
-              <w:pBdr>
-                <w:top w:val="nil"/>
-                <w:left w:val="nil"/>
-                <w:bottom w:val="nil"/>
-                <w:right w:val="nil"/>
-                <w:between w:val="nil"/>
-              </w:pBdr>
-              <w:spacing w:before="40" w:after="40"/>
-              <w:rPr>
-                <w:color w:val="000000"/>
-              </w:rPr>
-            </w:pPr>
-          </w:p>
-        </w:tc>
-      </w:tr>
     </w:tbl>
     <w:p>
       <w:pPr>
@@ -4803,6 +4850,19 @@
     </w:p>
     <w:p>
       <w:pPr>
+        <w:numPr>
+          <w:ilvl w:val="2"/>
+          <w:numId w:val="1"/>
+        </w:numPr>
+        <w:spacing w:line="276" w:lineRule="auto"/>
+        <w:jc w:val="both"/>
+      </w:pPr>
+      <w:r>
+        <w:t>Assumed that the ATM will always hold enough money for the customer to withdraw.</w:t>
+      </w:r>
+    </w:p>
+    <w:p>
+      <w:pPr>
         <w:pStyle w:val="Heading1"/>
         <w:numPr>
           <w:ilvl w:val="0"/>
@@ -5018,84 +5078,40 @@
         <w:spacing w:before="80"/>
         <w:jc w:val="both"/>
         <w:rPr>
-          <w:color w:val="FF0000"/>
-        </w:rPr>
-      </w:pPr>
-      <w:r>
-        <w:rPr>
-          <w:color w:val="FF0000"/>
-        </w:rPr>
-        <w:t xml:space="preserve">If a user does not have an account yet, then they will be able to do so by entering a username or password. (highlighted red just so </w:t>
-      </w:r>
-      <w:proofErr w:type="spellStart"/>
-      <w:r>
-        <w:rPr>
-          <w:color w:val="FF0000"/>
-        </w:rPr>
-        <w:t>i</w:t>
-      </w:r>
-      <w:proofErr w:type="spellEnd"/>
-      <w:r>
-        <w:rPr>
-          <w:color w:val="FF0000"/>
-        </w:rPr>
-        <w:t xml:space="preserve"> remember what </w:t>
-      </w:r>
-      <w:proofErr w:type="spellStart"/>
-      <w:r>
-        <w:rPr>
-          <w:color w:val="FF0000"/>
-        </w:rPr>
-        <w:t>i</w:t>
-      </w:r>
-      <w:proofErr w:type="spellEnd"/>
-      <w:r>
-        <w:rPr>
-          <w:color w:val="FF0000"/>
-        </w:rPr>
-        <w:t xml:space="preserve"> added, not sure how the process will be different between customer and teller though) </w:t>
+          <w:color w:val="000000" w:themeColor="text1"/>
+        </w:rPr>
+      </w:pPr>
+      <w:r>
+        <w:rPr>
+          <w:color w:val="000000" w:themeColor="text1"/>
+        </w:rPr>
+        <w:t xml:space="preserve">There can be multiple people under one bank account, </w:t>
       </w:r>
       <w:proofErr w:type="gramStart"/>
       <w:r>
         <w:rPr>
-          <w:color w:val="FF0000"/>
-        </w:rPr>
-        <w:t>( —</w:t>
+          <w:color w:val="000000" w:themeColor="text1"/>
+        </w:rPr>
+        <w:t>as long as</w:t>
       </w:r>
       <w:proofErr w:type="gramEnd"/>
       <w:r>
         <w:rPr>
-          <w:color w:val="FF0000"/>
-        </w:rPr>
-        <w:t xml:space="preserve"> I think creating an account should only be done by tellers in the branch, </w:t>
-      </w:r>
-      <w:proofErr w:type="spellStart"/>
-      <w:r>
-        <w:rPr>
-          <w:color w:val="FF0000"/>
-        </w:rPr>
-        <w:t>i</w:t>
-      </w:r>
-      <w:proofErr w:type="spellEnd"/>
-      <w:r>
-        <w:rPr>
-          <w:color w:val="FF0000"/>
-        </w:rPr>
-        <w:t xml:space="preserve"> </w:t>
-      </w:r>
-      <w:proofErr w:type="spellStart"/>
-      <w:r>
-        <w:rPr>
-          <w:color w:val="FF0000"/>
-        </w:rPr>
-        <w:t>dont</w:t>
-      </w:r>
-      <w:proofErr w:type="spellEnd"/>
-      <w:r>
-        <w:rPr>
-          <w:color w:val="FF0000"/>
-        </w:rPr>
-        <w:t xml:space="preserve"> think making an account at an atm should be allowed — Jeremy)</w:t>
+          <w:color w:val="000000" w:themeColor="text1"/>
+        </w:rPr>
+        <w:t xml:space="preserve"> they are approved by a teller.</w:t>
+      </w:r>
+    </w:p>
+    <w:p>
+      <w:pPr>
+        <w:pStyle w:val="Heading3"/>
+        <w:numPr>
+          <w:ilvl w:val="2"/>
+          <w:numId w:val="1"/>
+        </w:numPr>
+      </w:pPr>
+      <w:r>
+        <w:t>Server Module Requirements:</w:t>
       </w:r>
     </w:p>
     <w:p>
@@ -5113,27 +5129,17 @@
         </w:pBdr>
         <w:spacing w:before="80"/>
         <w:jc w:val="both"/>
-        <w:rPr>
-          <w:color w:val="FF0000"/>
-        </w:rPr>
-      </w:pPr>
-      <w:r>
-        <w:rPr>
-          <w:color w:val="FF0000"/>
-        </w:rPr>
-        <w:t>(Add more here if anyone wants to)</w:t>
-      </w:r>
-    </w:p>
-    <w:p>
-      <w:pPr>
-        <w:pStyle w:val="Heading3"/>
-        <w:numPr>
-          <w:ilvl w:val="2"/>
-          <w:numId w:val="1"/>
-        </w:numPr>
-      </w:pPr>
-      <w:r>
-        <w:t>Server Module Requirements:</w:t>
+      </w:pPr>
+      <w:r>
+        <w:t xml:space="preserve">The MTBA server must be able to handle multiple </w:t>
+      </w:r>
+      <w:proofErr w:type="gramStart"/>
+      <w:r>
+        <w:t>client</w:t>
+      </w:r>
+      <w:proofErr w:type="gramEnd"/>
+      <w:r>
+        <w:t xml:space="preserve"> and/or ATM connections at the same time.</w:t>
       </w:r>
     </w:p>
     <w:p>
@@ -5153,15 +5159,7 @@
         <w:jc w:val="both"/>
       </w:pPr>
       <w:r>
-        <w:t xml:space="preserve">The MTBA server must be able to handle multiple </w:t>
-      </w:r>
-      <w:proofErr w:type="gramStart"/>
-      <w:r>
-        <w:t>client</w:t>
-      </w:r>
-      <w:proofErr w:type="gramEnd"/>
-      <w:r>
-        <w:t xml:space="preserve"> and/or ATM connections at the same time.</w:t>
+        <w:t>The MTBA server will communicate with each other module.</w:t>
       </w:r>
     </w:p>
     <w:p>
@@ -5181,7 +5179,7 @@
         <w:jc w:val="both"/>
       </w:pPr>
       <w:r>
-        <w:t>The MTBA server will communicate with each other module.</w:t>
+        <w:t>The MTBA server will validate customer, teller, and ATM requests to ensure the account has sufficient funds to cover the requested action.</w:t>
       </w:r>
     </w:p>
     <w:p>
@@ -5201,7 +5199,7 @@
         <w:jc w:val="both"/>
       </w:pPr>
       <w:r>
-        <w:t>The MTBA server will validate customer, teller, and ATM requests to ensure the account has sufficient funds to cover the requested action.</w:t>
+        <w:t xml:space="preserve"> If a user enters an incorrect pin five times at an ATM within a single five-minute period, the server shall lock the customer out of their account until they see a teller and the teller unlocks their account. The server will use the Logger to log these failed attempts and flag the account.</w:t>
       </w:r>
     </w:p>
     <w:p>
@@ -5221,7 +5219,7 @@
         <w:jc w:val="both"/>
       </w:pPr>
       <w:r>
-        <w:t xml:space="preserve"> If a user enters an incorrect pin five times at an ATM within a single five-minute period, the server shall lock the customer out of their account until they see a teller and the teller unlocks their account. The server will use the Logger to log these failed attempts and flag the account.</w:t>
+        <w:t>The logs shall be immutable.</w:t>
       </w:r>
     </w:p>
     <w:p>
@@ -5241,7 +5239,7 @@
         <w:jc w:val="both"/>
       </w:pPr>
       <w:r>
-        <w:t>The logs shall be immutable.</w:t>
+        <w:t>The server shall authenticate all client connections before allowing access to system functionality</w:t>
       </w:r>
     </w:p>
     <w:p>
@@ -5261,7 +5259,7 @@
         <w:jc w:val="both"/>
       </w:pPr>
       <w:r>
-        <w:t>The server shall authenticate all client connections before allowing access to system functionality</w:t>
+        <w:t>The server should keep logs of all transactions and requests, with a manager who can see the logs and make notes on them</w:t>
       </w:r>
     </w:p>
     <w:p>
@@ -5281,7 +5279,7 @@
         <w:jc w:val="both"/>
       </w:pPr>
       <w:r>
-        <w:t>The server should keep logs of all transactions and requests, with a manager who can see the logs and make notes on them</w:t>
+        <w:t>The server shall enforce daily transaction limits for ATM and Teller operations.</w:t>
       </w:r>
     </w:p>
     <w:p>
@@ -5301,7 +5299,7 @@
         <w:jc w:val="both"/>
       </w:pPr>
       <w:r>
-        <w:t>The server shall enforce daily transaction limits for ATM and Teller operations.</w:t>
+        <w:t>The server shall contain a logging system that is accessible by only the Manager role.</w:t>
       </w:r>
     </w:p>
     <w:p>
@@ -5321,7 +5319,15 @@
         <w:jc w:val="both"/>
       </w:pPr>
       <w:r>
-        <w:t>The server shall contain a logging system that is accessible by only the Manager role.</w:t>
+        <w:t xml:space="preserve">The server </w:t>
+      </w:r>
+      <w:proofErr w:type="gramStart"/>
+      <w:r>
+        <w:t>shall</w:t>
+      </w:r>
+      <w:proofErr w:type="gramEnd"/>
+      <w:r>
+        <w:t xml:space="preserve"> update its records each time there is an attempted operation on a customer’s account including withdrawals, deposits, and account status changes</w:t>
       </w:r>
     </w:p>
     <w:p>
@@ -5341,16 +5347,20 @@
         <w:jc w:val="both"/>
       </w:pPr>
       <w:r>
+        <w:t>The server shall always</w:t>
+      </w:r>
+    </w:p>
+    <w:p>
+      <w:pPr>
+        <w:pStyle w:val="Heading3"/>
+        <w:numPr>
+          <w:ilvl w:val="2"/>
+          <w:numId w:val="1"/>
+        </w:numPr>
+      </w:pPr>
+      <w:r>
         <w:lastRenderedPageBreak/>
-        <w:t xml:space="preserve">The server </w:t>
-      </w:r>
-      <w:proofErr w:type="gramStart"/>
-      <w:r>
-        <w:t>shall</w:t>
-      </w:r>
-      <w:proofErr w:type="gramEnd"/>
-      <w:r>
-        <w:t xml:space="preserve"> update its records each time there is an attempted operation on a customer’s account including withdrawals, deposits, and account status changes</w:t>
+        <w:t>ATM Module Requirements:</w:t>
       </w:r>
     </w:p>
     <w:p>
@@ -5370,19 +5380,7 @@
         <w:jc w:val="both"/>
       </w:pPr>
       <w:r>
-        <w:t>The server shall always</w:t>
-      </w:r>
-    </w:p>
-    <w:p>
-      <w:pPr>
-        <w:pStyle w:val="Heading3"/>
-        <w:numPr>
-          <w:ilvl w:val="2"/>
-          <w:numId w:val="1"/>
-        </w:numPr>
-      </w:pPr>
-      <w:r>
-        <w:t>ATM Module Requirements:</w:t>
+        <w:t>Customers will only be able to deposit and withdraw $10000 per day at a teller.</w:t>
       </w:r>
     </w:p>
     <w:p>
@@ -5402,7 +5400,7 @@
         <w:jc w:val="both"/>
       </w:pPr>
       <w:r>
-        <w:t>Customers will only be able to deposit and withdraw $10000 per day at a teller.</w:t>
+        <w:t>The withdrawal limit for a customer at an ATM shall be $1000</w:t>
       </w:r>
     </w:p>
     <w:p>
@@ -5422,7 +5420,15 @@
         <w:jc w:val="both"/>
       </w:pPr>
       <w:r>
-        <w:t>The withdrawal limit for a customer at an ATM shall be $1000</w:t>
+        <w:t xml:space="preserve">The ATM shall allow customers </w:t>
+      </w:r>
+      <w:proofErr w:type="gramStart"/>
+      <w:r>
+        <w:t>to:</w:t>
+      </w:r>
+      <w:proofErr w:type="gramEnd"/>
+      <w:r>
+        <w:t xml:space="preserve"> withdraw cash, deposit cash, check account balances, and transfer funds between connected accounts.</w:t>
       </w:r>
     </w:p>
     <w:p>
@@ -5442,15 +5448,7 @@
         <w:jc w:val="both"/>
       </w:pPr>
       <w:r>
-        <w:t xml:space="preserve">The ATM shall allow customers </w:t>
-      </w:r>
-      <w:proofErr w:type="gramStart"/>
-      <w:r>
-        <w:t>to:</w:t>
-      </w:r>
-      <w:proofErr w:type="gramEnd"/>
-      <w:r>
-        <w:t xml:space="preserve"> withdraw cash, deposit cash, check account balances, and transfer funds between connected accounts.</w:t>
+        <w:t>The ATM shall confirm with the Logger that the selected account contains sufficient available funds before processing any withdrawal request</w:t>
       </w:r>
     </w:p>
     <w:p>
@@ -5470,7 +5468,17 @@
         <w:jc w:val="both"/>
       </w:pPr>
       <w:r>
-        <w:t>The ATM shall confirm with the Logger that the selected account contains sufficient available funds before processing any withdrawal request</w:t>
+        <w:t xml:space="preserve">The ATM shall display an error message if the requested transaction </w:t>
+      </w:r>
+      <w:proofErr w:type="spellStart"/>
+      <w:proofErr w:type="gramStart"/>
+      <w:r>
+        <w:t>can not</w:t>
+      </w:r>
+      <w:proofErr w:type="spellEnd"/>
+      <w:proofErr w:type="gramEnd"/>
+      <w:r>
+        <w:t xml:space="preserve"> be completed</w:t>
       </w:r>
     </w:p>
     <w:p>
@@ -5490,17 +5498,7 @@
         <w:jc w:val="both"/>
       </w:pPr>
       <w:r>
-        <w:t xml:space="preserve">The ATM shall display an error message if the requested transaction </w:t>
-      </w:r>
-      <w:proofErr w:type="spellStart"/>
-      <w:proofErr w:type="gramStart"/>
-      <w:r>
-        <w:t>can not</w:t>
-      </w:r>
-      <w:proofErr w:type="spellEnd"/>
-      <w:proofErr w:type="gramEnd"/>
-      <w:r>
-        <w:t xml:space="preserve"> be completed</w:t>
+        <w:t>The ATM shall provide input fields for both account ID and PIN entry</w:t>
       </w:r>
     </w:p>
     <w:p>
@@ -5520,7 +5518,7 @@
         <w:jc w:val="both"/>
       </w:pPr>
       <w:r>
-        <w:t>The ATM shall provide input fields for both account ID and PIN entry</w:t>
+        <w:t>The ATM shall display confirmation messages for successful transactions</w:t>
       </w:r>
     </w:p>
     <w:p>
@@ -5540,7 +5538,112 @@
         <w:jc w:val="both"/>
       </w:pPr>
       <w:r>
-        <w:t>The ATM shall display confirmation messages for successful transactions</w:t>
+        <w:t>The ATM shall log all login attempts via the Logger, including date, time, and success/failure</w:t>
+      </w:r>
+    </w:p>
+    <w:p>
+      <w:pPr>
+        <w:pStyle w:val="Heading3"/>
+        <w:numPr>
+          <w:ilvl w:val="2"/>
+          <w:numId w:val="1"/>
+        </w:numPr>
+      </w:pPr>
+      <w:r>
+        <w:t>Teller Module Requirements:</w:t>
+      </w:r>
+    </w:p>
+    <w:p>
+      <w:pPr>
+        <w:numPr>
+          <w:ilvl w:val="3"/>
+          <w:numId w:val="1"/>
+        </w:numPr>
+        <w:spacing w:before="80"/>
+        <w:jc w:val="both"/>
+      </w:pPr>
+      <w:r>
+        <w:t>Tellers will only be able to deposit and withdraw a combined total of $10,000 for a customer through their account per day.</w:t>
+      </w:r>
+    </w:p>
+    <w:p>
+      <w:pPr>
+        <w:numPr>
+          <w:ilvl w:val="3"/>
+          <w:numId w:val="1"/>
+        </w:numPr>
+        <w:spacing w:before="80"/>
+        <w:jc w:val="both"/>
+      </w:pPr>
+      <w:r>
+        <w:t>Upon request by the customer, the teller should be able to create or modify a customer’s account. </w:t>
+      </w:r>
+    </w:p>
+    <w:p>
+      <w:pPr>
+        <w:numPr>
+          <w:ilvl w:val="3"/>
+          <w:numId w:val="1"/>
+        </w:numPr>
+        <w:spacing w:before="80"/>
+        <w:jc w:val="both"/>
+      </w:pPr>
+      <w:r>
+        <w:t>The teller should be able to unlock customer accounts that are locked if the customer is present.</w:t>
+      </w:r>
+    </w:p>
+    <w:p>
+      <w:pPr>
+        <w:numPr>
+          <w:ilvl w:val="3"/>
+          <w:numId w:val="1"/>
+        </w:numPr>
+        <w:spacing w:before="80"/>
+        <w:jc w:val="both"/>
+      </w:pPr>
+      <w:r>
+        <w:t>Tellers should be able to transfer funds between customer accounts</w:t>
+      </w:r>
+    </w:p>
+    <w:p>
+      <w:pPr>
+        <w:numPr>
+          <w:ilvl w:val="3"/>
+          <w:numId w:val="1"/>
+        </w:numPr>
+        <w:spacing w:before="80"/>
+        <w:jc w:val="both"/>
+      </w:pPr>
+      <w:r>
+        <w:t>Tellers should be able to retrieve and display customer account information including balance, last 10 transactions, and account status</w:t>
+      </w:r>
+    </w:p>
+    <w:p>
+      <w:pPr>
+        <w:pStyle w:val="Heading2"/>
+        <w:numPr>
+          <w:ilvl w:val="1"/>
+          <w:numId w:val="1"/>
+        </w:numPr>
+      </w:pPr>
+      <w:bookmarkStart w:id="14" w:name="_pd21vexxkw67" w:colFirst="0" w:colLast="0"/>
+      <w:bookmarkEnd w:id="14"/>
+      <w:r>
+        <w:t>External Interface Requirements</w:t>
+      </w:r>
+    </w:p>
+    <w:p>
+      <w:pPr>
+        <w:pStyle w:val="Heading2"/>
+        <w:numPr>
+          <w:ilvl w:val="2"/>
+          <w:numId w:val="1"/>
+        </w:numPr>
+      </w:pPr>
+      <w:bookmarkStart w:id="15" w:name="_jqftam3zn9lb" w:colFirst="0" w:colLast="0"/>
+      <w:bookmarkEnd w:id="15"/>
+      <w:r>
+        <w:t>ATM Module Requirements</w:t>
       </w:r>
     </w:p>
     <w:p>
@@ -5560,112 +5663,7 @@
         <w:jc w:val="both"/>
       </w:pPr>
       <w:r>
-        <w:t>The ATM shall log all login attempts via the Logger, including date, time, and success/failure</w:t>
-      </w:r>
-    </w:p>
-    <w:p>
-      <w:pPr>
-        <w:pStyle w:val="Heading3"/>
-        <w:numPr>
-          <w:ilvl w:val="2"/>
-          <w:numId w:val="1"/>
-        </w:numPr>
-      </w:pPr>
-      <w:r>
-        <w:t>Teller Module Requirements:</w:t>
-      </w:r>
-    </w:p>
-    <w:p>
-      <w:pPr>
-        <w:numPr>
-          <w:ilvl w:val="3"/>
-          <w:numId w:val="1"/>
-        </w:numPr>
-        <w:spacing w:before="80"/>
-        <w:jc w:val="both"/>
-      </w:pPr>
-      <w:r>
-        <w:t>Tellers will only be able to deposit and withdraw a combined total of $10,000 for a customer through their account per day.</w:t>
-      </w:r>
-    </w:p>
-    <w:p>
-      <w:pPr>
-        <w:numPr>
-          <w:ilvl w:val="3"/>
-          <w:numId w:val="1"/>
-        </w:numPr>
-        <w:spacing w:before="80"/>
-        <w:jc w:val="both"/>
-      </w:pPr>
-      <w:r>
-        <w:t>Upon request by the customer, the teller should be able to create or modify a customer’s account. </w:t>
-      </w:r>
-    </w:p>
-    <w:p>
-      <w:pPr>
-        <w:numPr>
-          <w:ilvl w:val="3"/>
-          <w:numId w:val="1"/>
-        </w:numPr>
-        <w:spacing w:before="80"/>
-        <w:jc w:val="both"/>
-      </w:pPr>
-      <w:r>
-        <w:t>The teller should be able to unlock customer accounts that are locked if the customer is present.</w:t>
-      </w:r>
-    </w:p>
-    <w:p>
-      <w:pPr>
-        <w:numPr>
-          <w:ilvl w:val="3"/>
-          <w:numId w:val="1"/>
-        </w:numPr>
-        <w:spacing w:before="80"/>
-        <w:jc w:val="both"/>
-      </w:pPr>
-      <w:r>
-        <w:t>Tellers should be able to transfer funds between customer accounts</w:t>
-      </w:r>
-    </w:p>
-    <w:p>
-      <w:pPr>
-        <w:numPr>
-          <w:ilvl w:val="3"/>
-          <w:numId w:val="1"/>
-        </w:numPr>
-        <w:spacing w:before="80"/>
-        <w:jc w:val="both"/>
-      </w:pPr>
-      <w:r>
-        <w:t>Tellers should be able to retrieve and display customer account information including balance, last 10 transactions, and account status</w:t>
-      </w:r>
-    </w:p>
-    <w:p>
-      <w:pPr>
-        <w:pStyle w:val="Heading2"/>
-        <w:numPr>
-          <w:ilvl w:val="1"/>
-          <w:numId w:val="1"/>
-        </w:numPr>
-      </w:pPr>
-      <w:bookmarkStart w:id="14" w:name="_pd21vexxkw67" w:colFirst="0" w:colLast="0"/>
-      <w:bookmarkEnd w:id="14"/>
-      <w:r>
-        <w:t>External Interface Requirements</w:t>
-      </w:r>
-    </w:p>
-    <w:p>
-      <w:pPr>
-        <w:pStyle w:val="Heading2"/>
-        <w:numPr>
-          <w:ilvl w:val="2"/>
-          <w:numId w:val="1"/>
-        </w:numPr>
-      </w:pPr>
-      <w:bookmarkStart w:id="15" w:name="_jqftam3zn9lb" w:colFirst="0" w:colLast="0"/>
-      <w:bookmarkEnd w:id="15"/>
-      <w:r>
-        <w:t>ATM Module Requirements</w:t>
+        <w:t>The physical ATM must have a compatible interface to the software provided</w:t>
       </w:r>
     </w:p>
     <w:p>
@@ -5685,7 +5683,7 @@
         <w:jc w:val="both"/>
       </w:pPr>
       <w:r>
-        <w:t>The physical ATM must have a compatible interface to the software provided</w:t>
+        <w:t>The ATM must have network connectivity to communicate with the server</w:t>
       </w:r>
     </w:p>
     <w:p>
@@ -5705,7 +5703,7 @@
         <w:jc w:val="both"/>
       </w:pPr>
       <w:r>
-        <w:t>The ATM must have network connectivity to communicate with the server</w:t>
+        <w:t>The ATM shall transmit all transaction requests to the server using TCP/IP communication</w:t>
       </w:r>
     </w:p>
     <w:p>
@@ -5725,26 +5723,6 @@
         <w:jc w:val="both"/>
       </w:pPr>
       <w:r>
-        <w:t>The ATM shall transmit all transaction requests to the server using TCP/IP communication</w:t>
-      </w:r>
-    </w:p>
-    <w:p>
-      <w:pPr>
-        <w:numPr>
-          <w:ilvl w:val="3"/>
-          <w:numId w:val="1"/>
-        </w:numPr>
-        <w:pBdr>
-          <w:top w:val="nil"/>
-          <w:left w:val="nil"/>
-          <w:bottom w:val="nil"/>
-          <w:right w:val="nil"/>
-          <w:between w:val="nil"/>
-        </w:pBdr>
-        <w:spacing w:before="80"/>
-        <w:jc w:val="both"/>
-      </w:pPr>
-      <w:r>
         <w:t>The ATM interface shall restrict users to the operations permitted for customer accounts only</w:t>
       </w:r>
     </w:p>
@@ -5759,7 +5737,6 @@
       <w:bookmarkStart w:id="16" w:name="_4o1twdrkc4we" w:colFirst="0" w:colLast="0"/>
       <w:bookmarkEnd w:id="16"/>
       <w:r>
-        <w:lastRenderedPageBreak/>
         <w:t>Internal Interface Requirements</w:t>
       </w:r>
     </w:p>
@@ -5870,6 +5847,19 @@
     </w:p>
     <w:p>
       <w:pPr>
+        <w:numPr>
+          <w:ilvl w:val="2"/>
+          <w:numId w:val="1"/>
+        </w:numPr>
+        <w:spacing w:after="60" w:line="276" w:lineRule="auto"/>
+        <w:jc w:val="both"/>
+      </w:pPr>
+      <w:r>
+        <w:t>Every customer account should have a PIN number unique to them.</w:t>
+      </w:r>
+    </w:p>
+    <w:p>
+      <w:pPr>
         <w:pStyle w:val="Heading2"/>
         <w:numPr>
           <w:ilvl w:val="1"/>
@@ -6770,20 +6760,20 @@
           <w:lang w:val="en-US"/>
         </w:rPr>
         <w:lastRenderedPageBreak/>
-        <w:t xml:space="preserve">Basic Flow or Main Scenario: (1) A customer asks if a teller can close/freeze their bank account. (2) The customer will provide their </w:t>
+        <w:t xml:space="preserve">Basic Flow or Main Scenario: (1) A customer asks if a teller can close/freeze their bank account. (2) The customer will provide their PIN </w:t>
       </w:r>
       <w:r>
         <w:rPr>
           <w:color w:val="8064A2" w:themeColor="accent4"/>
           <w:lang w:val="en-US"/>
         </w:rPr>
-        <w:t xml:space="preserve">PIN (or some other confirmation) </w:t>
-      </w:r>
-      <w:r>
-        <w:rPr>
-          <w:lang w:val="en-US"/>
-        </w:rPr>
-        <w:t>for the teller to confirm their decision. (3) If the teller approves the request, then they will close/freeze the customer’s account.</w:t>
+        <w:t>(or some other confirmation)</w:t>
+      </w:r>
+      <w:r>
+        <w:rPr>
+          <w:lang w:val="en-US"/>
+        </w:rPr>
+        <w:t xml:space="preserve"> for the teller to confirm their decision. (3) If the teller approves the request, then they will close/freeze the customer’s account.</w:t>
       </w:r>
     </w:p>
     <w:p>
@@ -6816,13 +6806,13 @@
           <w:color w:val="8064A2" w:themeColor="accent4"/>
           <w:lang w:val="en-US"/>
         </w:rPr>
-        <w:t>for example</w:t>
-      </w:r>
-      <w:r>
-        <w:rPr>
-          <w:lang w:val="en-US"/>
-        </w:rPr>
-        <w:t>), then they can choose to freeze a customer’s account until the customer requests for their account to be unfrozen.</w:t>
+        <w:t xml:space="preserve">for example), </w:t>
+      </w:r>
+      <w:r>
+        <w:rPr>
+          <w:lang w:val="en-US"/>
+        </w:rPr>
+        <w:t>then they can choose to freeze a customer’s account until the customer requests for their account to be unfrozen.</w:t>
       </w:r>
     </w:p>
     <w:p>
@@ -6848,6 +6838,472 @@
         <w:rPr>
           <w:lang w:val="en-US"/>
         </w:rPr>
+        <w:t>Related Use Cases: UC_LOG_001 (Check log)</w:t>
+      </w:r>
+    </w:p>
+    <w:p>
+      <w:pPr>
+        <w:rPr>
+          <w:lang w:val="en-US"/>
+        </w:rPr>
+      </w:pPr>
+    </w:p>
+    <w:p>
+      <w:pPr>
+        <w:rPr>
+          <w:lang w:val="en-US"/>
+        </w:rPr>
+      </w:pPr>
+      <w:r>
+        <w:rPr>
+          <w:lang w:val="en-US"/>
+        </w:rPr>
+        <w:t>Use Case ID: UC_ACC_004</w:t>
+      </w:r>
+    </w:p>
+    <w:p>
+      <w:pPr>
+        <w:rPr>
+          <w:lang w:val="en-US"/>
+        </w:rPr>
+      </w:pPr>
+      <w:r>
+        <w:rPr>
+          <w:lang w:val="en-US"/>
+        </w:rPr>
+        <w:t>Use Case Name: Add person</w:t>
+      </w:r>
+    </w:p>
+    <w:p>
+      <w:pPr>
+        <w:rPr>
+          <w:lang w:val="en-US"/>
+        </w:rPr>
+      </w:pPr>
+      <w:r>
+        <w:rPr>
+          <w:lang w:val="en-US"/>
+        </w:rPr>
+        <w:t>Relevant Requirements: 3.1.1.9, 3.1.4.2</w:t>
+      </w:r>
+    </w:p>
+    <w:p>
+      <w:pPr>
+        <w:rPr>
+          <w:lang w:val="en-US"/>
+        </w:rPr>
+      </w:pPr>
+      <w:r>
+        <w:rPr>
+          <w:lang w:val="en-US"/>
+        </w:rPr>
+        <w:t>Primary Actor: Customer, Teller</w:t>
+      </w:r>
+    </w:p>
+    <w:p>
+      <w:pPr>
+        <w:rPr>
+          <w:lang w:val="en-US"/>
+        </w:rPr>
+      </w:pPr>
+      <w:r>
+        <w:rPr>
+          <w:lang w:val="en-US"/>
+        </w:rPr>
+        <w:t>Pre-conditions: </w:t>
+      </w:r>
+    </w:p>
+    <w:p>
+      <w:pPr>
+        <w:rPr>
+          <w:lang w:val="en-US"/>
+        </w:rPr>
+      </w:pPr>
+      <w:r>
+        <w:rPr>
+          <w:lang w:val="en-US"/>
+        </w:rPr>
+        <w:t>Post-conditions: A person is added to list of authorized customers who can access the account. </w:t>
+      </w:r>
+    </w:p>
+    <w:p>
+      <w:pPr>
+        <w:rPr>
+          <w:lang w:val="en-US"/>
+        </w:rPr>
+      </w:pPr>
+      <w:r>
+        <w:rPr>
+          <w:lang w:val="en-US"/>
+        </w:rPr>
+        <w:t>Basic Flow or Main Scenario: (1) Customer requests for a teller to add another person’s name under their bank account. (2) If the teller approves, they will add the person to the list of authorized customers for that bank account.</w:t>
+      </w:r>
+    </w:p>
+    <w:p>
+      <w:pPr>
+        <w:rPr>
+          <w:lang w:val="en-US"/>
+        </w:rPr>
+      </w:pPr>
+      <w:r>
+        <w:rPr>
+          <w:lang w:val="en-US"/>
+        </w:rPr>
+        <w:t>Extensions or Alternate Flows: (2) If the teller does not approve, they will not add the new person to the list of authorized customers for that bank account.</w:t>
+      </w:r>
+    </w:p>
+    <w:p>
+      <w:pPr>
+        <w:rPr>
+          <w:lang w:val="en-US"/>
+        </w:rPr>
+      </w:pPr>
+      <w:r>
+        <w:rPr>
+          <w:lang w:val="en-US"/>
+        </w:rPr>
+        <w:t>Exceptions: None</w:t>
+      </w:r>
+    </w:p>
+    <w:p>
+      <w:pPr>
+        <w:rPr>
+          <w:lang w:val="en-US"/>
+        </w:rPr>
+      </w:pPr>
+      <w:r>
+        <w:rPr>
+          <w:lang w:val="en-US"/>
+        </w:rPr>
+        <w:t>Related Use Cases: UC_ACC_02</w:t>
+      </w:r>
+    </w:p>
+    <w:p>
+      <w:pPr>
+        <w:rPr>
+          <w:lang w:val="en-US"/>
+        </w:rPr>
+      </w:pPr>
+    </w:p>
+    <w:p>
+      <w:pPr>
+        <w:rPr>
+          <w:lang w:val="en-US"/>
+        </w:rPr>
+      </w:pPr>
+      <w:r>
+        <w:rPr>
+          <w:lang w:val="en-US"/>
+        </w:rPr>
+        <w:t>Use Case ID: UC_LOG_001</w:t>
+      </w:r>
+    </w:p>
+    <w:p>
+      <w:pPr>
+        <w:rPr>
+          <w:lang w:val="en-US"/>
+        </w:rPr>
+      </w:pPr>
+      <w:r>
+        <w:rPr>
+          <w:lang w:val="en-US"/>
+        </w:rPr>
+        <w:t>Use Case Name: Check log</w:t>
+      </w:r>
+    </w:p>
+    <w:p>
+      <w:pPr>
+        <w:rPr>
+          <w:lang w:val="en-US"/>
+        </w:rPr>
+      </w:pPr>
+      <w:r>
+        <w:rPr>
+          <w:lang w:val="en-US"/>
+        </w:rPr>
+        <w:t>Relevant Requirements: 3.1.2.8, 3.1.2.10, 3.1.5.6</w:t>
+      </w:r>
+    </w:p>
+    <w:p>
+      <w:pPr>
+        <w:rPr>
+          <w:lang w:val="en-US"/>
+        </w:rPr>
+      </w:pPr>
+      <w:r>
+        <w:rPr>
+          <w:lang w:val="en-US"/>
+        </w:rPr>
+        <w:t>Primary Actor: Teller</w:t>
+      </w:r>
+    </w:p>
+    <w:p>
+      <w:pPr>
+        <w:rPr>
+          <w:lang w:val="en-US"/>
+        </w:rPr>
+      </w:pPr>
+      <w:r>
+        <w:rPr>
+          <w:lang w:val="en-US"/>
+        </w:rPr>
+        <w:t>Pre-conditions: A customer’s PIN number</w:t>
+      </w:r>
+    </w:p>
+    <w:p>
+      <w:pPr>
+        <w:rPr>
+          <w:lang w:val="en-US"/>
+        </w:rPr>
+      </w:pPr>
+      <w:r>
+        <w:rPr>
+          <w:lang w:val="en-US"/>
+        </w:rPr>
+        <w:t>Post-conditions: The teller will see the logs of a customer’s account </w:t>
+      </w:r>
+    </w:p>
+    <w:p>
+      <w:pPr>
+        <w:rPr>
+          <w:lang w:val="en-US"/>
+        </w:rPr>
+      </w:pPr>
+      <w:r>
+        <w:rPr>
+          <w:lang w:val="en-US"/>
+        </w:rPr>
+        <w:t xml:space="preserve">Basic Flow or Main Scenario: (1) The teller will enter a customer’s unique PIN number. (2) If the teller has </w:t>
+      </w:r>
+      <w:proofErr w:type="gramStart"/>
+      <w:r>
+        <w:rPr>
+          <w:lang w:val="en-US"/>
+        </w:rPr>
+        <w:t>manage</w:t>
+      </w:r>
+      <w:proofErr w:type="gramEnd"/>
+      <w:r>
+        <w:rPr>
+          <w:lang w:val="en-US"/>
+        </w:rPr>
+        <w:t xml:space="preserve"> status, then they can view the logs on the customer’s account</w:t>
+      </w:r>
+    </w:p>
+    <w:p>
+      <w:pPr>
+        <w:rPr>
+          <w:lang w:val="en-US"/>
+        </w:rPr>
+      </w:pPr>
+      <w:r>
+        <w:rPr>
+          <w:lang w:val="en-US"/>
+        </w:rPr>
+        <w:t>Extensions or Alternate Flows: (2) If the teller does not have manager status, then they cannot access the logs.</w:t>
+      </w:r>
+    </w:p>
+    <w:p>
+      <w:pPr>
+        <w:rPr>
+          <w:lang w:val="en-US"/>
+        </w:rPr>
+      </w:pPr>
+      <w:r>
+        <w:rPr>
+          <w:lang w:val="en-US"/>
+        </w:rPr>
+        <w:t>Exceptions: None</w:t>
+      </w:r>
+    </w:p>
+    <w:p>
+      <w:pPr>
+        <w:rPr>
+          <w:lang w:val="en-US"/>
+        </w:rPr>
+      </w:pPr>
+      <w:r>
+        <w:rPr>
+          <w:lang w:val="en-US"/>
+        </w:rPr>
+        <w:t>Related Use Cases: UC_ACC_03 (Close/Freeze Account)</w:t>
+      </w:r>
+    </w:p>
+    <w:p>
+      <w:pPr>
+        <w:rPr>
+          <w:lang w:val="en-US"/>
+        </w:rPr>
+      </w:pPr>
+    </w:p>
+    <w:p>
+      <w:pPr>
+        <w:rPr>
+          <w:lang w:val="en-US"/>
+        </w:rPr>
+      </w:pPr>
+      <w:r>
+        <w:rPr>
+          <w:lang w:val="en-US"/>
+        </w:rPr>
+        <w:t>Use Case ID: UC_MT_001</w:t>
+      </w:r>
+    </w:p>
+    <w:p>
+      <w:pPr>
+        <w:rPr>
+          <w:lang w:val="en-US"/>
+        </w:rPr>
+      </w:pPr>
+      <w:r>
+        <w:rPr>
+          <w:lang w:val="en-US"/>
+        </w:rPr>
+        <w:t>Use Case Name: Check Account Balance</w:t>
+      </w:r>
+    </w:p>
+    <w:p>
+      <w:pPr>
+        <w:rPr>
+          <w:lang w:val="en-US"/>
+        </w:rPr>
+      </w:pPr>
+      <w:r>
+        <w:rPr>
+          <w:lang w:val="en-US"/>
+        </w:rPr>
+        <w:t>Relevant Requirements: 3.1.1.1</w:t>
+      </w:r>
+    </w:p>
+    <w:p>
+      <w:pPr>
+        <w:rPr>
+          <w:lang w:val="en-US"/>
+        </w:rPr>
+      </w:pPr>
+      <w:r>
+        <w:rPr>
+          <w:lang w:val="en-US"/>
+        </w:rPr>
+        <w:t>Primary Actor: Customer, Teller</w:t>
+      </w:r>
+    </w:p>
+    <w:p>
+      <w:pPr>
+        <w:rPr>
+          <w:lang w:val="en-US"/>
+        </w:rPr>
+      </w:pPr>
+      <w:r>
+        <w:rPr>
+          <w:lang w:val="en-US"/>
+        </w:rPr>
+        <w:t>Pre-conditions: None</w:t>
+      </w:r>
+    </w:p>
+    <w:p>
+      <w:pPr>
+        <w:rPr>
+          <w:lang w:val="en-US"/>
+        </w:rPr>
+      </w:pPr>
+      <w:r>
+        <w:rPr>
+          <w:lang w:val="en-US"/>
+        </w:rPr>
+        <w:t>Post-conditions: Account balance will be displayed through a message</w:t>
+      </w:r>
+    </w:p>
+    <w:p>
+      <w:pPr>
+        <w:rPr>
+          <w:lang w:val="en-US"/>
+        </w:rPr>
+      </w:pPr>
+      <w:r>
+        <w:rPr>
+          <w:lang w:val="en-US"/>
+        </w:rPr>
+        <w:t>Basic Flow or Main Scenario: (1) Customer/teller will be prompted with whether they want to see customer’s savings, checking, or credit. (2) The system displays the amount of money in their savings. (3) Customer will choose whether they want to view an account balance again or return to main menu.</w:t>
+      </w:r>
+    </w:p>
+    <w:p>
+      <w:pPr>
+        <w:rPr>
+          <w:lang w:val="en-US"/>
+        </w:rPr>
+      </w:pPr>
+      <w:r>
+        <w:rPr>
+          <w:lang w:val="en-US"/>
+        </w:rPr>
+        <w:t>Extensions or Alternate Flows</w:t>
+      </w:r>
+      <w:proofErr w:type="gramStart"/>
+      <w:r>
+        <w:rPr>
+          <w:lang w:val="en-US"/>
+        </w:rPr>
+        <w:t>:  (</w:t>
+      </w:r>
+      <w:proofErr w:type="gramEnd"/>
+      <w:r>
+        <w:rPr>
+          <w:lang w:val="en-US"/>
+        </w:rPr>
+        <w:t xml:space="preserve">2) The system displays the amount of money in their </w:t>
+      </w:r>
+      <w:proofErr w:type="spellStart"/>
+      <w:r>
+        <w:rPr>
+          <w:lang w:val="en-US"/>
+        </w:rPr>
+        <w:t>checkings</w:t>
+      </w:r>
+      <w:proofErr w:type="spellEnd"/>
+      <w:r>
+        <w:rPr>
+          <w:lang w:val="en-US"/>
+        </w:rPr>
+        <w:t>. (3) Customer will choose whether they want to withdraw again or return to main menu.</w:t>
+      </w:r>
+    </w:p>
+    <w:p>
+      <w:pPr>
+        <w:rPr>
+          <w:lang w:val="en-US"/>
+        </w:rPr>
+      </w:pPr>
+      <w:r>
+        <w:rPr>
+          <w:lang w:val="en-US"/>
+        </w:rPr>
+        <w:t>(2) The system displays the customer’s credit. </w:t>
+      </w:r>
+    </w:p>
+    <w:p>
+      <w:pPr>
+        <w:rPr>
+          <w:lang w:val="en-US"/>
+        </w:rPr>
+      </w:pPr>
+      <w:r>
+        <w:rPr>
+          <w:lang w:val="en-US"/>
+        </w:rPr>
+        <w:t>Exceptions: None</w:t>
+      </w:r>
+    </w:p>
+    <w:p>
+      <w:pPr>
+        <w:rPr>
+          <w:lang w:val="en-US"/>
+        </w:rPr>
+      </w:pPr>
+      <w:r>
+        <w:rPr>
+          <w:lang w:val="en-US"/>
+        </w:rPr>
         <w:t>Related Use Cases: </w:t>
       </w:r>
     </w:p>
@@ -6868,33 +7324,461 @@
         <w:rPr>
           <w:lang w:val="en-US"/>
         </w:rPr>
-        <w:t>Use Case ID: UC_MT_001</w:t>
-      </w:r>
-    </w:p>
-    <w:p>
-      <w:pPr>
-        <w:rPr>
-          <w:lang w:val="en-US"/>
-        </w:rPr>
-      </w:pPr>
-      <w:r>
-        <w:rPr>
-          <w:lang w:val="en-US"/>
-        </w:rPr>
-        <w:t>Use Case Name: Check Account Balance</w:t>
-      </w:r>
-    </w:p>
-    <w:p>
-      <w:pPr>
-        <w:rPr>
-          <w:lang w:val="en-US"/>
-        </w:rPr>
-      </w:pPr>
-      <w:r>
-        <w:rPr>
-          <w:lang w:val="en-US"/>
-        </w:rPr>
-        <w:t>Relevant Requirements: 3.1.1.1</w:t>
+        <w:t>Use Case ID: UC_MT_002</w:t>
+      </w:r>
+    </w:p>
+    <w:p>
+      <w:pPr>
+        <w:rPr>
+          <w:lang w:val="en-US"/>
+        </w:rPr>
+      </w:pPr>
+      <w:r>
+        <w:rPr>
+          <w:lang w:val="en-US"/>
+        </w:rPr>
+        <w:lastRenderedPageBreak/>
+        <w:t>Use Case Name: Withdraw from Account</w:t>
+      </w:r>
+    </w:p>
+    <w:p>
+      <w:pPr>
+        <w:rPr>
+          <w:lang w:val="en-US"/>
+        </w:rPr>
+      </w:pPr>
+      <w:r>
+        <w:rPr>
+          <w:lang w:val="en-US"/>
+        </w:rPr>
+        <w:t>Relevant Requirements: 3.1.1.1, 3.1.1.2, 3.1.1.8, 3.1.3.1, 3.1.4.1</w:t>
+      </w:r>
+    </w:p>
+    <w:p>
+      <w:pPr>
+        <w:rPr>
+          <w:lang w:val="en-US"/>
+        </w:rPr>
+      </w:pPr>
+      <w:r>
+        <w:rPr>
+          <w:lang w:val="en-US"/>
+        </w:rPr>
+        <w:t>Primary Actor: Customer, Teller</w:t>
+      </w:r>
+    </w:p>
+    <w:p>
+      <w:pPr>
+        <w:rPr>
+          <w:lang w:val="en-US"/>
+        </w:rPr>
+      </w:pPr>
+      <w:r>
+        <w:rPr>
+          <w:lang w:val="en-US"/>
+        </w:rPr>
+        <w:t xml:space="preserve">Pre-conditions: </w:t>
+      </w:r>
+      <w:proofErr w:type="gramStart"/>
+      <w:r>
+        <w:rPr>
+          <w:lang w:val="en-US"/>
+        </w:rPr>
+        <w:t>An</w:t>
+      </w:r>
+      <w:proofErr w:type="gramEnd"/>
+      <w:r>
+        <w:rPr>
+          <w:lang w:val="en-US"/>
+        </w:rPr>
+        <w:t xml:space="preserve"> </w:t>
+      </w:r>
+      <w:proofErr w:type="gramStart"/>
+      <w:r>
+        <w:rPr>
+          <w:lang w:val="en-US"/>
+        </w:rPr>
+        <w:t>number</w:t>
+      </w:r>
+      <w:proofErr w:type="gramEnd"/>
+      <w:r>
+        <w:rPr>
+          <w:lang w:val="en-US"/>
+        </w:rPr>
+        <w:t xml:space="preserve"> of </w:t>
+      </w:r>
+      <w:proofErr w:type="gramStart"/>
+      <w:r>
+        <w:rPr>
+          <w:lang w:val="en-US"/>
+        </w:rPr>
+        <w:t>money</w:t>
+      </w:r>
+      <w:proofErr w:type="gramEnd"/>
+      <w:r>
+        <w:rPr>
+          <w:lang w:val="en-US"/>
+        </w:rPr>
+        <w:t xml:space="preserve"> to withdraw </w:t>
+      </w:r>
+    </w:p>
+    <w:p>
+      <w:pPr>
+        <w:rPr>
+          <w:lang w:val="en-US"/>
+        </w:rPr>
+      </w:pPr>
+      <w:r>
+        <w:rPr>
+          <w:lang w:val="en-US"/>
+        </w:rPr>
+        <w:t>Post-conditions: Withdrawn money is subtracted from the account.</w:t>
+      </w:r>
+    </w:p>
+    <w:p>
+      <w:pPr>
+        <w:rPr>
+          <w:lang w:val="en-US"/>
+        </w:rPr>
+      </w:pPr>
+      <w:r>
+        <w:rPr>
+          <w:lang w:val="en-US"/>
+        </w:rPr>
+        <w:t>Basic Flow or Main Scenario: (</w:t>
+      </w:r>
+      <w:proofErr w:type="gramStart"/>
+      <w:r>
+        <w:rPr>
+          <w:lang w:val="en-US"/>
+        </w:rPr>
+        <w:t>1)The</w:t>
+      </w:r>
+      <w:proofErr w:type="gramEnd"/>
+      <w:r>
+        <w:rPr>
+          <w:lang w:val="en-US"/>
+        </w:rPr>
+        <w:t xml:space="preserve"> customer enters the amount of money the customer wants to withdraw (through ATM or </w:t>
+      </w:r>
+      <w:proofErr w:type="gramStart"/>
+      <w:r>
+        <w:rPr>
+          <w:lang w:val="en-US"/>
+        </w:rPr>
+        <w:t>teller</w:t>
+      </w:r>
+      <w:proofErr w:type="gramEnd"/>
+      <w:r>
+        <w:rPr>
+          <w:lang w:val="en-US"/>
+        </w:rPr>
+        <w:t xml:space="preserve">). (2) Customer will be prompted with whether they want to withdraw from savings or </w:t>
+      </w:r>
+      <w:proofErr w:type="spellStart"/>
+      <w:r>
+        <w:rPr>
+          <w:lang w:val="en-US"/>
+        </w:rPr>
+        <w:t>checkings</w:t>
+      </w:r>
+      <w:proofErr w:type="spellEnd"/>
+      <w:r>
+        <w:rPr>
+          <w:lang w:val="en-US"/>
+        </w:rPr>
+        <w:t xml:space="preserve"> account. (3) If the amount of money does not exceed the daily limit nor is it greater than the amount stored in the selected account, then the money will be subtracted from the account. (4) Successful withdrawal will be added to the log.  </w:t>
+      </w:r>
+    </w:p>
+    <w:p>
+      <w:pPr>
+        <w:rPr>
+          <w:lang w:val="en-US"/>
+        </w:rPr>
+      </w:pPr>
+      <w:r>
+        <w:rPr>
+          <w:lang w:val="en-US"/>
+        </w:rPr>
+        <w:t>Extensions or Alternate Flows: None</w:t>
+      </w:r>
+    </w:p>
+    <w:p>
+      <w:pPr>
+        <w:rPr>
+          <w:lang w:val="en-US"/>
+        </w:rPr>
+      </w:pPr>
+      <w:r>
+        <w:rPr>
+          <w:lang w:val="en-US"/>
+        </w:rPr>
+        <w:t>Exceptions: (3) If the actor enters an amount of money that is greater than the daily limit, display a message telling the user that. (4) Failed withdrawal will be added to log.</w:t>
+      </w:r>
+    </w:p>
+    <w:p>
+      <w:pPr>
+        <w:rPr>
+          <w:lang w:val="en-US"/>
+        </w:rPr>
+      </w:pPr>
+      <w:r>
+        <w:rPr>
+          <w:lang w:val="en-US"/>
+        </w:rPr>
+        <w:t>(3) If the actor enters an amount of money that is greater than the balance stored in the account, display a message telling the user that. (4) Failed withdrawal will be added to log</w:t>
+      </w:r>
+    </w:p>
+    <w:p>
+      <w:pPr>
+        <w:rPr>
+          <w:lang w:val="en-US"/>
+        </w:rPr>
+      </w:pPr>
+      <w:r>
+        <w:rPr>
+          <w:lang w:val="en-US"/>
+        </w:rPr>
+        <w:t>Related Use Cases: </w:t>
+      </w:r>
+    </w:p>
+    <w:p>
+      <w:pPr>
+        <w:rPr>
+          <w:lang w:val="en-US"/>
+        </w:rPr>
+      </w:pPr>
+    </w:p>
+    <w:p>
+      <w:pPr>
+        <w:rPr>
+          <w:lang w:val="en-US"/>
+        </w:rPr>
+      </w:pPr>
+      <w:r>
+        <w:rPr>
+          <w:lang w:val="en-US"/>
+        </w:rPr>
+        <w:t>Use Case ID: UC_MT_003</w:t>
+      </w:r>
+    </w:p>
+    <w:p>
+      <w:pPr>
+        <w:rPr>
+          <w:lang w:val="en-US"/>
+        </w:rPr>
+      </w:pPr>
+      <w:r>
+        <w:rPr>
+          <w:lang w:val="en-US"/>
+        </w:rPr>
+        <w:t>Use Case Name: Deposit to Account</w:t>
+      </w:r>
+    </w:p>
+    <w:p>
+      <w:pPr>
+        <w:rPr>
+          <w:lang w:val="en-US"/>
+        </w:rPr>
+      </w:pPr>
+      <w:r>
+        <w:rPr>
+          <w:lang w:val="en-US"/>
+        </w:rPr>
+        <w:t>Relevant Requirements: 3.1.1.1, 3.1.1.2, 3.1.1.8, 3.1.3.1, 3.1.4.1</w:t>
+      </w:r>
+    </w:p>
+    <w:p>
+      <w:pPr>
+        <w:rPr>
+          <w:lang w:val="en-US"/>
+        </w:rPr>
+      </w:pPr>
+      <w:r>
+        <w:rPr>
+          <w:lang w:val="en-US"/>
+        </w:rPr>
+        <w:t>Primary Actor: Customer, Teller</w:t>
+      </w:r>
+    </w:p>
+    <w:p>
+      <w:pPr>
+        <w:rPr>
+          <w:lang w:val="en-US"/>
+        </w:rPr>
+      </w:pPr>
+      <w:r>
+        <w:rPr>
+          <w:lang w:val="en-US"/>
+        </w:rPr>
+        <w:t xml:space="preserve">Pre-conditions: </w:t>
+      </w:r>
+      <w:proofErr w:type="gramStart"/>
+      <w:r>
+        <w:rPr>
+          <w:lang w:val="en-US"/>
+        </w:rPr>
+        <w:t>An</w:t>
+      </w:r>
+      <w:proofErr w:type="gramEnd"/>
+      <w:r>
+        <w:rPr>
+          <w:lang w:val="en-US"/>
+        </w:rPr>
+        <w:t xml:space="preserve"> number of </w:t>
+      </w:r>
+      <w:proofErr w:type="gramStart"/>
+      <w:r>
+        <w:rPr>
+          <w:lang w:val="en-US"/>
+        </w:rPr>
+        <w:t>money</w:t>
+      </w:r>
+      <w:proofErr w:type="gramEnd"/>
+      <w:r>
+        <w:rPr>
+          <w:lang w:val="en-US"/>
+        </w:rPr>
+        <w:t xml:space="preserve"> to deposit</w:t>
+      </w:r>
+    </w:p>
+    <w:p>
+      <w:pPr>
+        <w:rPr>
+          <w:lang w:val="en-US"/>
+        </w:rPr>
+      </w:pPr>
+      <w:r>
+        <w:rPr>
+          <w:lang w:val="en-US"/>
+        </w:rPr>
+        <w:t>Post-conditions: Deposited money is added to the account.</w:t>
+      </w:r>
+    </w:p>
+    <w:p>
+      <w:pPr>
+        <w:rPr>
+          <w:lang w:val="en-US"/>
+        </w:rPr>
+      </w:pPr>
+      <w:r>
+        <w:rPr>
+          <w:lang w:val="en-US"/>
+        </w:rPr>
+        <w:t>Basic Flow or Main Scenario: (</w:t>
+      </w:r>
+      <w:proofErr w:type="gramStart"/>
+      <w:r>
+        <w:rPr>
+          <w:lang w:val="en-US"/>
+        </w:rPr>
+        <w:t>1)The</w:t>
+      </w:r>
+      <w:proofErr w:type="gramEnd"/>
+      <w:r>
+        <w:rPr>
+          <w:lang w:val="en-US"/>
+        </w:rPr>
+        <w:t xml:space="preserve"> customer enters the amount of money they want to deposit (through ATM or teller). (2) Customer will be prompted with whether they want to deposit money to savings or </w:t>
+      </w:r>
+      <w:proofErr w:type="spellStart"/>
+      <w:r>
+        <w:rPr>
+          <w:lang w:val="en-US"/>
+        </w:rPr>
+        <w:t>checkings</w:t>
+      </w:r>
+      <w:proofErr w:type="spellEnd"/>
+      <w:r>
+        <w:rPr>
+          <w:lang w:val="en-US"/>
+        </w:rPr>
+        <w:t xml:space="preserve"> account. (3) If the amount of money does not exceed the daily limit, then the money will be subtracted from the account. (4) Successful deposit will be added to the log.</w:t>
+      </w:r>
+    </w:p>
+    <w:p>
+      <w:pPr>
+        <w:rPr>
+          <w:lang w:val="en-US"/>
+        </w:rPr>
+      </w:pPr>
+      <w:r>
+        <w:rPr>
+          <w:lang w:val="en-US"/>
+        </w:rPr>
+        <w:t>Extensions or Alternate Flows: None</w:t>
+      </w:r>
+    </w:p>
+    <w:p>
+      <w:pPr>
+        <w:rPr>
+          <w:lang w:val="en-US"/>
+        </w:rPr>
+      </w:pPr>
+      <w:r>
+        <w:rPr>
+          <w:lang w:val="en-US"/>
+        </w:rPr>
+        <w:t>Exceptions: (3) If the actor enters an amount of money that is greater than the daily limit, display a message telling the user that. (4) Failed deposit will be added to the log.</w:t>
+      </w:r>
+    </w:p>
+    <w:p>
+      <w:pPr>
+        <w:rPr>
+          <w:lang w:val="en-US"/>
+        </w:rPr>
+      </w:pPr>
+      <w:r>
+        <w:rPr>
+          <w:lang w:val="en-US"/>
+        </w:rPr>
+        <w:t>Related Use Cases:</w:t>
+      </w:r>
+    </w:p>
+    <w:p>
+      <w:pPr>
+        <w:rPr>
+          <w:lang w:val="en-US"/>
+        </w:rPr>
+      </w:pPr>
+    </w:p>
+    <w:p>
+      <w:pPr>
+        <w:rPr>
+          <w:lang w:val="en-US"/>
+        </w:rPr>
+      </w:pPr>
+      <w:r>
+        <w:rPr>
+          <w:lang w:val="en-US"/>
+        </w:rPr>
+        <w:t>Use Case ID: UC_MT_004</w:t>
+      </w:r>
+    </w:p>
+    <w:p>
+      <w:pPr>
+        <w:rPr>
+          <w:lang w:val="en-US"/>
+        </w:rPr>
+      </w:pPr>
+      <w:r>
+        <w:rPr>
+          <w:lang w:val="en-US"/>
+        </w:rPr>
+        <w:t>Use Case Name: Transfer funds</w:t>
+      </w:r>
+    </w:p>
+    <w:p>
+      <w:pPr>
+        <w:rPr>
+          <w:lang w:val="en-US"/>
+        </w:rPr>
+      </w:pPr>
+      <w:r>
+        <w:rPr>
+          <w:lang w:val="en-US"/>
+        </w:rPr>
+        <w:t>Relevant Requirements: 3.1.3.3, 3.1.4.4</w:t>
       </w:r>
     </w:p>
     <w:p>
@@ -6920,60 +7804,75 @@
         <w:rPr>
           <w:lang w:val="en-US"/>
         </w:rPr>
-        <w:t>Pre-conditions: None</w:t>
-      </w:r>
-    </w:p>
-    <w:p>
-      <w:pPr>
-        <w:rPr>
-          <w:lang w:val="en-US"/>
-        </w:rPr>
-      </w:pPr>
-      <w:r>
-        <w:rPr>
-          <w:lang w:val="en-US"/>
-        </w:rPr>
-        <w:t>Post-conditions: Account balance will be displayed through a message</w:t>
-      </w:r>
-    </w:p>
-    <w:p>
-      <w:pPr>
-        <w:rPr>
-          <w:lang w:val="en-US"/>
-        </w:rPr>
-      </w:pPr>
-      <w:r>
-        <w:rPr>
-          <w:lang w:val="en-US"/>
-        </w:rPr>
-        <w:t>Basic Flow or Main Scenario: (1) Customer will be prompted with whether they want to see their savings, checking, or credit. (2) The system displays the amount of money in their savings. (3) Customer will choose whether they want to view an account balance again or return to main menu.</w:t>
-      </w:r>
-    </w:p>
-    <w:p>
-      <w:pPr>
-        <w:rPr>
-          <w:lang w:val="en-US"/>
-        </w:rPr>
-      </w:pPr>
-      <w:r>
-        <w:rPr>
-          <w:lang w:val="en-US"/>
-        </w:rPr>
-        <w:t>Extensions or Alternate Flows</w:t>
+        <w:t xml:space="preserve">Pre-conditions: A number of </w:t>
       </w:r>
       <w:proofErr w:type="gramStart"/>
       <w:r>
         <w:rPr>
           <w:lang w:val="en-US"/>
         </w:rPr>
-        <w:t>:  (</w:t>
+        <w:t>money</w:t>
       </w:r>
       <w:proofErr w:type="gramEnd"/>
       <w:r>
         <w:rPr>
           <w:lang w:val="en-US"/>
         </w:rPr>
-        <w:t xml:space="preserve">2) The system displays the amount of money in their </w:t>
+        <w:t xml:space="preserve"> to transfer</w:t>
+      </w:r>
+    </w:p>
+    <w:p>
+      <w:pPr>
+        <w:rPr>
+          <w:lang w:val="en-US"/>
+        </w:rPr>
+      </w:pPr>
+      <w:r>
+        <w:rPr>
+          <w:lang w:val="en-US"/>
+        </w:rPr>
+        <w:t>Post-conditions: Money is transferred from one account to another.</w:t>
+      </w:r>
+    </w:p>
+    <w:p>
+      <w:pPr>
+        <w:rPr>
+          <w:lang w:val="en-US"/>
+        </w:rPr>
+      </w:pPr>
+      <w:r>
+        <w:rPr>
+          <w:lang w:val="en-US"/>
+        </w:rPr>
+        <w:t>Basic Flow or Main Scenario: (</w:t>
+      </w:r>
+      <w:proofErr w:type="gramStart"/>
+      <w:r>
+        <w:rPr>
+          <w:lang w:val="en-US"/>
+        </w:rPr>
+        <w:t>1)The</w:t>
+      </w:r>
+      <w:proofErr w:type="gramEnd"/>
+      <w:r>
+        <w:rPr>
+          <w:lang w:val="en-US"/>
+        </w:rPr>
+        <w:t xml:space="preserve"> customer enters the amount of money they want to transfer through the teller/ATM. (2) Customer will choose which account (savings/checking) to take money out of. (3) If the amount of money does not exceed the daily limit nor is it greater than the amount </w:t>
+      </w:r>
+      <w:proofErr w:type="gramStart"/>
+      <w:r>
+        <w:rPr>
+          <w:lang w:val="en-US"/>
+        </w:rPr>
+        <w:t>stored</w:t>
+      </w:r>
+      <w:proofErr w:type="gramEnd"/>
+      <w:r>
+        <w:rPr>
+          <w:lang w:val="en-US"/>
+        </w:rPr>
+        <w:t xml:space="preserve"> the selected account, then the customer can choose which account they want to transfer money to (savings/</w:t>
       </w:r>
       <w:proofErr w:type="spellStart"/>
       <w:r>
@@ -6987,788 +7886,210 @@
         <w:rPr>
           <w:lang w:val="en-US"/>
         </w:rPr>
-        <w:t>. (3) Customer will choose whether they want to withdraw again or return to main menu.</w:t>
-      </w:r>
-    </w:p>
-    <w:p>
-      <w:pPr>
-        <w:rPr>
-          <w:lang w:val="en-US"/>
-        </w:rPr>
-      </w:pPr>
-      <w:r>
-        <w:rPr>
-          <w:lang w:val="en-US"/>
-        </w:rPr>
-        <w:t>(2) The system displays the customer’s credit. (3) Customer will choose whether they want to view an account balance again or return to main menu.</w:t>
-      </w:r>
-    </w:p>
-    <w:p>
-      <w:pPr>
-        <w:rPr>
-          <w:lang w:val="en-US"/>
-        </w:rPr>
-      </w:pPr>
-      <w:r>
-        <w:rPr>
-          <w:lang w:val="en-US"/>
-        </w:rPr>
-        <w:t>Exceptions: None</w:t>
-      </w:r>
-    </w:p>
-    <w:p>
-      <w:pPr>
-        <w:rPr>
-          <w:lang w:val="en-US"/>
-        </w:rPr>
-      </w:pPr>
-      <w:r>
-        <w:rPr>
-          <w:lang w:val="en-US"/>
-        </w:rPr>
-        <w:t xml:space="preserve">Related Use Cases: </w:t>
+        <w:t>). (</w:t>
+      </w:r>
+      <w:proofErr w:type="gramStart"/>
+      <w:r>
+        <w:rPr>
+          <w:lang w:val="en-US"/>
+        </w:rPr>
+        <w:t>4)The</w:t>
+      </w:r>
+      <w:proofErr w:type="gramEnd"/>
+      <w:r>
+        <w:rPr>
+          <w:lang w:val="en-US"/>
+        </w:rPr>
+        <w:t xml:space="preserve"> money gets transferred from the first selected account to the second selected account. (5) Successful transfer will be added to the log.</w:t>
+      </w:r>
+    </w:p>
+    <w:p>
+      <w:pPr>
+        <w:rPr>
+          <w:lang w:val="en-US"/>
+        </w:rPr>
+      </w:pPr>
+      <w:r>
+        <w:rPr>
+          <w:lang w:val="en-US"/>
+        </w:rPr>
+        <w:t>Extensions or Alternate Flows: None</w:t>
+      </w:r>
+    </w:p>
+    <w:p>
+      <w:pPr>
+        <w:rPr>
+          <w:lang w:val="en-US"/>
+        </w:rPr>
+      </w:pPr>
+      <w:r>
+        <w:rPr>
+          <w:lang w:val="en-US"/>
+        </w:rPr>
+        <w:t>Exceptions: (3) If the actor enters an amount of money that is greater than the daily limit, display a message telling the user that. (4) Failed transfer will be added to the log.</w:t>
+      </w:r>
+    </w:p>
+    <w:p>
+      <w:pPr>
+        <w:rPr>
+          <w:lang w:val="en-US"/>
+        </w:rPr>
+      </w:pPr>
+      <w:r>
+        <w:rPr>
+          <w:lang w:val="en-US"/>
+        </w:rPr>
+        <w:t>(3) If the actor enters an amount of money that is greater than the balance stored in the account, display a message telling the user that. (4) Failed transfer will be added to the log.</w:t>
+      </w:r>
+    </w:p>
+    <w:p>
+      <w:pPr>
+        <w:rPr>
+          <w:lang w:val="en-US"/>
+        </w:rPr>
+      </w:pPr>
+      <w:r>
+        <w:rPr>
+          <w:lang w:val="en-US"/>
+        </w:rPr>
+        <w:t>Related Use Cases: </w:t>
+      </w:r>
+    </w:p>
+    <w:p>
+      <w:pPr>
+        <w:rPr>
+          <w:lang w:val="en-US"/>
+        </w:rPr>
+      </w:pPr>
+      <w:r>
+        <w:rPr>
+          <w:lang w:val="en-US"/>
+        </w:rPr>
+        <w:br/>
+      </w:r>
+      <w:r>
+        <w:rPr>
+          <w:lang w:val="en-US"/>
+        </w:rPr>
+        <w:br/>
+      </w:r>
+      <w:r>
+        <w:rPr>
+          <w:lang w:val="en-US"/>
+        </w:rPr>
+        <w:br/>
+      </w:r>
+      <w:r>
+        <w:rPr>
+          <w:lang w:val="en-US"/>
+        </w:rPr>
+        <w:lastRenderedPageBreak/>
+        <w:br/>
+      </w:r>
+    </w:p>
+    <w:p>
+      <w:pPr>
+        <w:rPr>
+          <w:lang w:val="en-US"/>
+        </w:rPr>
+      </w:pPr>
+      <w:r>
+        <w:rPr>
+          <w:lang w:val="en-US"/>
+        </w:rPr>
+        <w:t>Use Case ID: UC_SEC_002</w:t>
+      </w:r>
+    </w:p>
+    <w:p>
+      <w:pPr>
+        <w:rPr>
+          <w:lang w:val="en-US"/>
+        </w:rPr>
+      </w:pPr>
+      <w:r>
+        <w:rPr>
+          <w:lang w:val="en-US"/>
+        </w:rPr>
+        <w:t>Use Case Name: Account Locks After Failed Pin Attempts</w:t>
+      </w:r>
+    </w:p>
+    <w:p>
+      <w:pPr>
+        <w:rPr>
+          <w:lang w:val="en-US"/>
+        </w:rPr>
+      </w:pPr>
+      <w:r>
+        <w:rPr>
+          <w:lang w:val="en-US"/>
+        </w:rPr>
+        <w:t xml:space="preserve">Relevant </w:t>
+      </w:r>
+      <w:proofErr w:type="gramStart"/>
+      <w:r>
+        <w:rPr>
+          <w:lang w:val="en-US"/>
+        </w:rPr>
+        <w:t>Requirements :</w:t>
+      </w:r>
+      <w:proofErr w:type="gramEnd"/>
+      <w:r>
+        <w:rPr>
+          <w:lang w:val="en-US"/>
+        </w:rPr>
+        <w:t xml:space="preserve"> 3.1.2.4, 3.1.3.2, 4.1.3</w:t>
+      </w:r>
+    </w:p>
+    <w:p>
+      <w:pPr>
+        <w:rPr>
+          <w:lang w:val="en-US"/>
+        </w:rPr>
+      </w:pPr>
+      <w:r>
+        <w:rPr>
+          <w:lang w:val="en-US"/>
+        </w:rPr>
+        <w:t>Primary Actor: Customer (via ATM)</w:t>
+      </w:r>
+    </w:p>
+    <w:p>
+      <w:pPr>
+        <w:rPr>
+          <w:lang w:val="en-US"/>
+        </w:rPr>
+      </w:pPr>
+      <w:r>
+        <w:rPr>
+          <w:lang w:val="en-US"/>
+        </w:rPr>
+        <w:t>Pre-Conditions: (1) Customer attempts to authenticate at an ATM (2) Account is not currently locked (3) ATM is connected to the server via TCP/IP</w:t>
+      </w:r>
+    </w:p>
+    <w:p>
+      <w:pPr>
+        <w:rPr>
+          <w:lang w:val="en-US"/>
+        </w:rPr>
+      </w:pPr>
+      <w:r>
+        <w:rPr>
+          <w:lang w:val="en-US"/>
+        </w:rPr>
+        <w:t xml:space="preserve">Post-Conditions: (1) Account is locked after </w:t>
       </w:r>
       <w:r>
         <w:rPr>
           <w:color w:val="8064A2" w:themeColor="accent4"/>
           <w:lang w:val="en-US"/>
         </w:rPr>
-        <w:t>main menu</w:t>
-      </w:r>
-    </w:p>
-    <w:p>
-      <w:pPr>
-        <w:rPr>
-          <w:lang w:val="en-US"/>
-        </w:rPr>
-      </w:pPr>
-    </w:p>
-    <w:p>
-      <w:pPr>
-        <w:rPr>
-          <w:lang w:val="en-US"/>
-        </w:rPr>
-      </w:pPr>
-      <w:r>
-        <w:rPr>
-          <w:lang w:val="en-US"/>
-        </w:rPr>
-        <w:t>Use Case ID: UC_MT_002</w:t>
-      </w:r>
-    </w:p>
-    <w:p>
-      <w:pPr>
-        <w:rPr>
-          <w:lang w:val="en-US"/>
-        </w:rPr>
-      </w:pPr>
-      <w:r>
-        <w:rPr>
-          <w:lang w:val="en-US"/>
-        </w:rPr>
-        <w:t>Use Case Name: Withdraw from Account</w:t>
-      </w:r>
-    </w:p>
-    <w:p>
-      <w:pPr>
-        <w:rPr>
-          <w:lang w:val="en-US"/>
-        </w:rPr>
-      </w:pPr>
-      <w:r>
-        <w:rPr>
-          <w:lang w:val="en-US"/>
-        </w:rPr>
-        <w:t>Relevant Requirements: 3.1.1.1, 3.1.1.2, 3.1.3.1, 3.1.4.1</w:t>
-      </w:r>
-    </w:p>
-    <w:p>
-      <w:pPr>
-        <w:rPr>
-          <w:lang w:val="en-US"/>
-        </w:rPr>
-      </w:pPr>
-      <w:r>
-        <w:rPr>
-          <w:lang w:val="en-US"/>
-        </w:rPr>
-        <w:t>Primary Actor: Customer, Teller, ATM</w:t>
-      </w:r>
-    </w:p>
-    <w:p>
-      <w:pPr>
-        <w:rPr>
-          <w:lang w:val="en-US"/>
-        </w:rPr>
-      </w:pPr>
-      <w:r>
-        <w:rPr>
-          <w:lang w:val="en-US"/>
-        </w:rPr>
-        <w:t xml:space="preserve">Pre-conditions: </w:t>
-      </w:r>
-      <w:proofErr w:type="gramStart"/>
-      <w:r>
-        <w:rPr>
-          <w:lang w:val="en-US"/>
-        </w:rPr>
-        <w:t>An</w:t>
-      </w:r>
-      <w:proofErr w:type="gramEnd"/>
-      <w:r>
-        <w:rPr>
-          <w:lang w:val="en-US"/>
-        </w:rPr>
-        <w:t xml:space="preserve"> </w:t>
-      </w:r>
-      <w:proofErr w:type="gramStart"/>
-      <w:r>
-        <w:rPr>
-          <w:lang w:val="en-US"/>
-        </w:rPr>
-        <w:t>number</w:t>
-      </w:r>
-      <w:proofErr w:type="gramEnd"/>
-      <w:r>
-        <w:rPr>
-          <w:lang w:val="en-US"/>
-        </w:rPr>
-        <w:t xml:space="preserve"> of </w:t>
-      </w:r>
-      <w:proofErr w:type="gramStart"/>
-      <w:r>
-        <w:rPr>
-          <w:lang w:val="en-US"/>
-        </w:rPr>
-        <w:t>money</w:t>
-      </w:r>
-      <w:proofErr w:type="gramEnd"/>
-      <w:r>
-        <w:rPr>
-          <w:lang w:val="en-US"/>
-        </w:rPr>
-        <w:t xml:space="preserve"> to withdraw </w:t>
-      </w:r>
-    </w:p>
-    <w:p>
-      <w:pPr>
-        <w:rPr>
-          <w:lang w:val="en-US"/>
-        </w:rPr>
-      </w:pPr>
-      <w:r>
-        <w:rPr>
-          <w:lang w:val="en-US"/>
-        </w:rPr>
-        <w:t>Post-conditions: Withdrawn money is subtracted from the account.</w:t>
-      </w:r>
-    </w:p>
-    <w:p>
-      <w:pPr>
-        <w:rPr>
-          <w:lang w:val="en-US"/>
-        </w:rPr>
-      </w:pPr>
-      <w:r>
-        <w:rPr>
-          <w:lang w:val="en-US"/>
-        </w:rPr>
-        <w:t xml:space="preserve">Basic Flow or Main Scenario: (1) Customer will be prompted with whether they want to withdraw from savings or </w:t>
-      </w:r>
-      <w:proofErr w:type="spellStart"/>
-      <w:r>
-        <w:rPr>
-          <w:lang w:val="en-US"/>
-        </w:rPr>
-        <w:t>checkings</w:t>
-      </w:r>
-      <w:proofErr w:type="spellEnd"/>
-      <w:r>
-        <w:rPr>
-          <w:lang w:val="en-US"/>
-        </w:rPr>
-        <w:t xml:space="preserve"> account. (2) The actor enters the amount of money the customer wants to withdraw. (3) If the amount of money does not exceed the daily limit nor is it greater than the amount stored in the selected account, then the money will be subtracted from the account. (4) Customer will choose whether they want to withdraw again or return to main menu.</w:t>
-      </w:r>
-    </w:p>
-    <w:p>
-      <w:pPr>
-        <w:rPr>
-          <w:lang w:val="en-US"/>
-        </w:rPr>
-      </w:pPr>
-      <w:r>
-        <w:rPr>
-          <w:lang w:val="en-US"/>
-        </w:rPr>
-        <w:t>Extensions or Alternate Flows: None</w:t>
-      </w:r>
-    </w:p>
-    <w:p>
-      <w:pPr>
-        <w:rPr>
-          <w:lang w:val="en-US"/>
-        </w:rPr>
-      </w:pPr>
-      <w:r>
-        <w:rPr>
-          <w:lang w:val="en-US"/>
-        </w:rPr>
-        <w:t>Exceptions: (3) If the actor enters an amount of money that is greater than the daily limit, display a message telling the user that. (4) Customer will choose whether they want to withdraw again or return to main menu.</w:t>
-      </w:r>
-    </w:p>
-    <w:p>
-      <w:pPr>
-        <w:rPr>
-          <w:lang w:val="en-US"/>
-        </w:rPr>
-      </w:pPr>
-      <w:r>
-        <w:rPr>
-          <w:lang w:val="en-US"/>
-        </w:rPr>
-        <w:t>(3) If the actor enters an amount of money that is greater than the balance stored in the account, display a message telling the user that. (4) Customer will choose whether they want to withdraw again or return to main menu.</w:t>
-      </w:r>
-    </w:p>
-    <w:p>
-      <w:pPr>
-        <w:rPr>
-          <w:lang w:val="en-US"/>
-        </w:rPr>
-      </w:pPr>
-      <w:r>
-        <w:rPr>
-          <w:lang w:val="en-US"/>
-        </w:rPr>
-        <w:t xml:space="preserve">Related Use Cases: </w:t>
-      </w:r>
-      <w:r>
-        <w:rPr>
-          <w:color w:val="8064A2" w:themeColor="accent4"/>
-          <w:lang w:val="en-US"/>
-        </w:rPr>
-        <w:t>main menu</w:t>
-      </w:r>
-    </w:p>
-    <w:p>
-      <w:pPr>
-        <w:rPr>
-          <w:lang w:val="en-US"/>
-        </w:rPr>
-      </w:pPr>
-    </w:p>
-    <w:p>
-      <w:pPr>
-        <w:rPr>
-          <w:lang w:val="en-US"/>
-        </w:rPr>
-      </w:pPr>
-      <w:r>
-        <w:rPr>
-          <w:lang w:val="en-US"/>
-        </w:rPr>
-        <w:t>Use Case ID: UC_MT_003</w:t>
-      </w:r>
-    </w:p>
-    <w:p>
-      <w:pPr>
-        <w:rPr>
-          <w:lang w:val="en-US"/>
-        </w:rPr>
-      </w:pPr>
-      <w:r>
-        <w:rPr>
-          <w:lang w:val="en-US"/>
-        </w:rPr>
-        <w:t>Use Case Name: Deposit to Account</w:t>
-      </w:r>
-    </w:p>
-    <w:p>
-      <w:pPr>
-        <w:rPr>
-          <w:lang w:val="en-US"/>
-        </w:rPr>
-      </w:pPr>
-      <w:r>
-        <w:rPr>
-          <w:lang w:val="en-US"/>
-        </w:rPr>
-        <w:t>Relevant Requirements: 3.1.1.1, 3.1.1.2, 3.1.3.1, 3.1.4.1</w:t>
-      </w:r>
-    </w:p>
-    <w:p>
-      <w:pPr>
-        <w:rPr>
-          <w:lang w:val="en-US"/>
-        </w:rPr>
-      </w:pPr>
-      <w:r>
-        <w:rPr>
-          <w:lang w:val="en-US"/>
-        </w:rPr>
-        <w:t>Primary Actor: Customer, Teller, ATM</w:t>
-      </w:r>
-    </w:p>
-    <w:p>
-      <w:pPr>
-        <w:rPr>
-          <w:lang w:val="en-US"/>
-        </w:rPr>
-      </w:pPr>
-      <w:r>
-        <w:rPr>
-          <w:lang w:val="en-US"/>
-        </w:rPr>
-        <w:t xml:space="preserve">Pre-conditions: </w:t>
-      </w:r>
-      <w:proofErr w:type="gramStart"/>
-      <w:r>
-        <w:rPr>
-          <w:lang w:val="en-US"/>
-        </w:rPr>
-        <w:t>An</w:t>
-      </w:r>
-      <w:proofErr w:type="gramEnd"/>
-      <w:r>
-        <w:rPr>
-          <w:lang w:val="en-US"/>
-        </w:rPr>
-        <w:t xml:space="preserve"> number of </w:t>
-      </w:r>
-      <w:proofErr w:type="gramStart"/>
-      <w:r>
-        <w:rPr>
-          <w:lang w:val="en-US"/>
-        </w:rPr>
-        <w:t>money</w:t>
-      </w:r>
-      <w:proofErr w:type="gramEnd"/>
-      <w:r>
-        <w:rPr>
-          <w:lang w:val="en-US"/>
-        </w:rPr>
-        <w:t xml:space="preserve"> to deposit</w:t>
-      </w:r>
-    </w:p>
-    <w:p>
-      <w:pPr>
-        <w:rPr>
-          <w:lang w:val="en-US"/>
-        </w:rPr>
-      </w:pPr>
-      <w:r>
-        <w:rPr>
-          <w:lang w:val="en-US"/>
-        </w:rPr>
-        <w:t>Post-conditions: Deposited money is added to the account.</w:t>
-      </w:r>
-    </w:p>
-    <w:p>
-      <w:pPr>
-        <w:rPr>
-          <w:lang w:val="en-US"/>
-        </w:rPr>
-      </w:pPr>
-      <w:r>
-        <w:rPr>
-          <w:lang w:val="en-US"/>
-        </w:rPr>
-        <w:t xml:space="preserve">Basic Flow or Main Scenario: (1) Customer will be prompted with whether they want to deposit money to savings or </w:t>
-      </w:r>
-      <w:proofErr w:type="spellStart"/>
-      <w:r>
-        <w:rPr>
-          <w:lang w:val="en-US"/>
-        </w:rPr>
-        <w:t>checkings</w:t>
-      </w:r>
-      <w:proofErr w:type="spellEnd"/>
-      <w:r>
-        <w:rPr>
-          <w:lang w:val="en-US"/>
-        </w:rPr>
-        <w:t xml:space="preserve"> account. (2) The actor enters the amount of money the customer wants to deposit. (3) </w:t>
-      </w:r>
-      <w:r>
-        <w:rPr>
-          <w:lang w:val="en-US"/>
-        </w:rPr>
-        <w:lastRenderedPageBreak/>
-        <w:t>If the amount of money does not exceed the daily limit, then the money will be subtracted from the account. (4) Customer will choose whether they want to withdraw again or return to main menu.</w:t>
-      </w:r>
-    </w:p>
-    <w:p>
-      <w:pPr>
-        <w:rPr>
-          <w:lang w:val="en-US"/>
-        </w:rPr>
-      </w:pPr>
-      <w:r>
-        <w:rPr>
-          <w:lang w:val="en-US"/>
-        </w:rPr>
-        <w:t>Extensions or Alternate Flows: None</w:t>
-      </w:r>
-    </w:p>
-    <w:p>
-      <w:pPr>
-        <w:rPr>
-          <w:lang w:val="en-US"/>
-        </w:rPr>
-      </w:pPr>
-      <w:r>
-        <w:rPr>
-          <w:lang w:val="en-US"/>
-        </w:rPr>
-        <w:t>Exceptions: (3) If the actor enters an amount of money that is greater than the daily limit, display a message telling the user that. (4) Customer will choose whether they want to withdraw again or return to main menu.</w:t>
-      </w:r>
-    </w:p>
-    <w:p>
-      <w:pPr>
-        <w:rPr>
-          <w:color w:val="8064A2" w:themeColor="accent4"/>
-          <w:lang w:val="en-US"/>
-        </w:rPr>
-      </w:pPr>
-      <w:r>
-        <w:rPr>
-          <w:lang w:val="en-US"/>
-        </w:rPr>
-        <w:t xml:space="preserve">Related Use Cases: </w:t>
-      </w:r>
-      <w:r>
-        <w:rPr>
-          <w:color w:val="8064A2" w:themeColor="accent4"/>
-          <w:lang w:val="en-US"/>
-        </w:rPr>
-        <w:t>main menu</w:t>
-      </w:r>
-    </w:p>
-    <w:p>
-      <w:pPr>
-        <w:rPr>
-          <w:lang w:val="en-US"/>
-        </w:rPr>
-      </w:pPr>
-    </w:p>
-    <w:p>
-      <w:pPr>
-        <w:rPr>
-          <w:lang w:val="en-US"/>
-        </w:rPr>
-      </w:pPr>
-      <w:r>
-        <w:rPr>
-          <w:lang w:val="en-US"/>
-        </w:rPr>
-        <w:t>Use Case ID: UC_MT_004</w:t>
-      </w:r>
-    </w:p>
-    <w:p>
-      <w:pPr>
-        <w:rPr>
-          <w:lang w:val="en-US"/>
-        </w:rPr>
-      </w:pPr>
-      <w:r>
-        <w:rPr>
-          <w:lang w:val="en-US"/>
-        </w:rPr>
-        <w:t>Use Case Name: Transfer funds</w:t>
-      </w:r>
-    </w:p>
-    <w:p>
-      <w:pPr>
-        <w:rPr>
-          <w:lang w:val="en-US"/>
-        </w:rPr>
-      </w:pPr>
-      <w:r>
-        <w:rPr>
-          <w:lang w:val="en-US"/>
-        </w:rPr>
-        <w:t>Relevant Requirements: 3.1.3.3, 3.1.4.4</w:t>
-      </w:r>
-    </w:p>
-    <w:p>
-      <w:pPr>
-        <w:rPr>
-          <w:lang w:val="en-US"/>
-        </w:rPr>
-      </w:pPr>
-      <w:r>
-        <w:rPr>
-          <w:lang w:val="en-US"/>
-        </w:rPr>
-        <w:t>Primary Actor: Customer, Teller, ATM</w:t>
-      </w:r>
-    </w:p>
-    <w:p>
-      <w:pPr>
-        <w:rPr>
-          <w:lang w:val="en-US"/>
-        </w:rPr>
-      </w:pPr>
-      <w:r>
-        <w:rPr>
-          <w:lang w:val="en-US"/>
-        </w:rPr>
-        <w:t xml:space="preserve">Pre-conditions: A number of </w:t>
-      </w:r>
-      <w:proofErr w:type="gramStart"/>
-      <w:r>
-        <w:rPr>
-          <w:lang w:val="en-US"/>
-        </w:rPr>
-        <w:t>money</w:t>
-      </w:r>
-      <w:proofErr w:type="gramEnd"/>
-      <w:r>
-        <w:rPr>
-          <w:lang w:val="en-US"/>
-        </w:rPr>
-        <w:t xml:space="preserve"> to transfer</w:t>
-      </w:r>
-    </w:p>
-    <w:p>
-      <w:pPr>
-        <w:rPr>
-          <w:lang w:val="en-US"/>
-        </w:rPr>
-      </w:pPr>
-      <w:r>
-        <w:rPr>
-          <w:lang w:val="en-US"/>
-        </w:rPr>
-        <w:t>Post-conditions: Money is transferred from one account to another.</w:t>
-      </w:r>
-    </w:p>
-    <w:p>
-      <w:pPr>
-        <w:rPr>
-          <w:lang w:val="en-US"/>
-        </w:rPr>
-      </w:pPr>
-      <w:r>
-        <w:rPr>
-          <w:lang w:val="en-US"/>
-        </w:rPr>
-        <w:t>Basic Flow or Main Scenario: (1) Customer will choose which account (savings/checking) to take money out of. (2) The customer enters the amount of money they want to transfer through the teller/ATM. (3) If the amount of money does not exceed the daily limit nor is it greater than the amount stored the selected account, then the customer can choose which account they want to transfer money to (savings/</w:t>
-      </w:r>
-      <w:proofErr w:type="spellStart"/>
-      <w:r>
-        <w:rPr>
-          <w:lang w:val="en-US"/>
-        </w:rPr>
-        <w:t>checkings</w:t>
-      </w:r>
-      <w:proofErr w:type="spellEnd"/>
-      <w:r>
-        <w:rPr>
-          <w:lang w:val="en-US"/>
-        </w:rPr>
-        <w:t>). (</w:t>
-      </w:r>
-      <w:proofErr w:type="gramStart"/>
-      <w:r>
-        <w:rPr>
-          <w:lang w:val="en-US"/>
-        </w:rPr>
-        <w:t>4)The</w:t>
-      </w:r>
-      <w:proofErr w:type="gramEnd"/>
-      <w:r>
-        <w:rPr>
-          <w:lang w:val="en-US"/>
-        </w:rPr>
-        <w:t xml:space="preserve"> money gets transferred from the first selected account to the second selected account. (5) Customer will choose whether they want to make another transfer or return to main menu.</w:t>
-      </w:r>
-    </w:p>
-    <w:p>
-      <w:pPr>
-        <w:rPr>
-          <w:lang w:val="en-US"/>
-        </w:rPr>
-      </w:pPr>
-      <w:r>
-        <w:rPr>
-          <w:lang w:val="en-US"/>
-        </w:rPr>
-        <w:t>Extensions or Alternate Flows: None</w:t>
-      </w:r>
-    </w:p>
-    <w:p>
-      <w:pPr>
-        <w:rPr>
-          <w:lang w:val="en-US"/>
-        </w:rPr>
-      </w:pPr>
-      <w:r>
-        <w:rPr>
-          <w:lang w:val="en-US"/>
-        </w:rPr>
-        <w:t>Exceptions: (3) If the actor enters an amount of money that is greater than the daily limit, display a message telling the user that. (4) Customer will choose whether they want to transfer funds again or return to main menu.</w:t>
-      </w:r>
-    </w:p>
-    <w:p>
-      <w:pPr>
-        <w:rPr>
-          <w:lang w:val="en-US"/>
-        </w:rPr>
-      </w:pPr>
-      <w:r>
-        <w:rPr>
-          <w:lang w:val="en-US"/>
-        </w:rPr>
-        <w:t>(3) If the actor enters an amount of money that is greater than the balance stored in the account, display a message telling the user that. 4 Customer will choose whether they want to transfer funds again or return to main menu.</w:t>
-      </w:r>
-    </w:p>
-    <w:p>
-      <w:pPr>
-        <w:rPr>
-          <w:lang w:val="en-US"/>
-        </w:rPr>
-      </w:pPr>
-      <w:r>
-        <w:rPr>
-          <w:lang w:val="en-US"/>
-        </w:rPr>
-        <w:t xml:space="preserve">Related Use Cases: </w:t>
-      </w:r>
-      <w:r>
-        <w:rPr>
-          <w:color w:val="8064A2" w:themeColor="accent4"/>
-          <w:lang w:val="en-US"/>
-        </w:rPr>
-        <w:t>main menu</w:t>
-      </w:r>
-    </w:p>
-    <w:p>
-      <w:pPr>
-        <w:rPr>
-          <w:lang w:val="en-US"/>
-        </w:rPr>
-      </w:pPr>
-      <w:r>
-        <w:rPr>
-          <w:lang w:val="en-US"/>
-        </w:rPr>
-        <w:br/>
-      </w:r>
-      <w:r>
-        <w:rPr>
-          <w:lang w:val="en-US"/>
-        </w:rPr>
-        <w:br/>
-      </w:r>
-      <w:r>
-        <w:rPr>
-          <w:lang w:val="en-US"/>
-        </w:rPr>
-        <w:br/>
-      </w:r>
-      <w:r>
-        <w:rPr>
-          <w:lang w:val="en-US"/>
-        </w:rPr>
-        <w:br/>
-      </w:r>
-      <w:r>
-        <w:rPr>
-          <w:lang w:val="en-US"/>
-        </w:rPr>
-        <w:br/>
-      </w:r>
-    </w:p>
-    <w:p>
-      <w:pPr>
-        <w:rPr>
-          <w:lang w:val="en-US"/>
-        </w:rPr>
-      </w:pPr>
-      <w:r>
-        <w:rPr>
-          <w:lang w:val="en-US"/>
-        </w:rPr>
-        <w:t>Use Case ID: UC_SEC_002</w:t>
-      </w:r>
-    </w:p>
-    <w:p>
-      <w:pPr>
-        <w:rPr>
-          <w:lang w:val="en-US"/>
-        </w:rPr>
-      </w:pPr>
-      <w:r>
-        <w:rPr>
-          <w:lang w:val="en-US"/>
-        </w:rPr>
-        <w:t>Use Case Name: Account Locks After Failed Pin Attempts</w:t>
-      </w:r>
-    </w:p>
-    <w:p>
-      <w:pPr>
-        <w:rPr>
-          <w:lang w:val="en-US"/>
-        </w:rPr>
-      </w:pPr>
-      <w:r>
-        <w:rPr>
-          <w:lang w:val="en-US"/>
-        </w:rPr>
-        <w:t xml:space="preserve">Relevant </w:t>
-      </w:r>
-      <w:proofErr w:type="gramStart"/>
-      <w:r>
-        <w:rPr>
-          <w:lang w:val="en-US"/>
-        </w:rPr>
-        <w:t>Requirements :</w:t>
-      </w:r>
-      <w:proofErr w:type="gramEnd"/>
-      <w:r>
-        <w:rPr>
-          <w:lang w:val="en-US"/>
-        </w:rPr>
-        <w:t xml:space="preserve"> 3.1.2.4, 3.1.3.2, 4.1.3</w:t>
-      </w:r>
-    </w:p>
-    <w:p>
-      <w:pPr>
-        <w:rPr>
-          <w:lang w:val="en-US"/>
-        </w:rPr>
-      </w:pPr>
-      <w:r>
-        <w:rPr>
-          <w:lang w:val="en-US"/>
-        </w:rPr>
-        <w:t>Primary Actor: Customer (via ATM)</w:t>
-      </w:r>
-    </w:p>
-    <w:p>
-      <w:pPr>
-        <w:rPr>
-          <w:lang w:val="en-US"/>
-        </w:rPr>
-      </w:pPr>
-      <w:r>
-        <w:rPr>
-          <w:lang w:val="en-US"/>
-        </w:rPr>
-        <w:t>Pre-Conditions: (1) Customer attempts to authenticate at an ATM (2) Account is not currently locked (3) ATM is connected to the server via TCP/IP</w:t>
-      </w:r>
-    </w:p>
-    <w:p>
-      <w:pPr>
-        <w:rPr>
-          <w:lang w:val="en-US"/>
-        </w:rPr>
-      </w:pPr>
-      <w:r>
-        <w:rPr>
-          <w:lang w:val="en-US"/>
-        </w:rPr>
-        <w:t xml:space="preserve">Post-Conditions: (1) Account is locked after five incorrect (if we are still sticking to five) PIN attempts within a </w:t>
+        <w:t xml:space="preserve">five incorrect (if we are still sticking to five) </w:t>
+      </w:r>
+      <w:r>
+        <w:rPr>
+          <w:lang w:val="en-US"/>
+        </w:rPr>
+        <w:t xml:space="preserve">PIN attempts within a </w:t>
       </w:r>
       <w:proofErr w:type="gramStart"/>
       <w:r>

</xml_diff>